<commit_message>
Looked up new funds and revenue sources in FY25 data and added notes for each.
</commit_message>
<xml_diff>
--- a/data/FY2025 Files/FY25 New Data Items.docx
+++ b/data/FY2025 Files/FY25 New Data Items.docx
@@ -34,7 +34,7 @@
                     <pic:cNvPicPr/>
                   </pic:nvPicPr>
                   <pic:blipFill>
-                    <a:blip r:embed="rId4"/>
+                    <a:blip r:embed="rId5"/>
                     <a:stretch>
                       <a:fillRect/>
                     </a:stretch>
@@ -64,7 +64,6 @@
       <w:tblPr>
         <w:tblW w:w="9346" w:type="dxa"/>
         <w:tblCellSpacing w:w="0" w:type="dxa"/>
-        <w:shd w:val="clear" w:color="auto" w:fill="282A36"/>
         <w:tblCellMar>
           <w:top w:w="15" w:type="dxa"/>
           <w:left w:w="15" w:type="dxa"/>
@@ -88,7 +87,6 @@
         <w:tc>
           <w:tcPr>
             <w:tcW w:w="0" w:type="auto"/>
-            <w:shd w:val="clear" w:color="auto" w:fill="282A36"/>
             <w:vAlign w:val="center"/>
             <w:hideMark/>
           </w:tcPr>
@@ -106,7 +104,6 @@
         <w:tc>
           <w:tcPr>
             <w:tcW w:w="0" w:type="auto"/>
-            <w:shd w:val="clear" w:color="auto" w:fill="282A36"/>
             <w:noWrap/>
             <w:tcMar>
               <w:top w:w="30" w:type="dxa"/>
@@ -128,7 +125,6 @@
         <w:tc>
           <w:tcPr>
             <w:tcW w:w="0" w:type="auto"/>
-            <w:shd w:val="clear" w:color="auto" w:fill="282A36"/>
             <w:noWrap/>
             <w:tcMar>
               <w:top w:w="30" w:type="dxa"/>
@@ -152,7 +148,6 @@
         <w:tc>
           <w:tcPr>
             <w:tcW w:w="0" w:type="auto"/>
-            <w:shd w:val="clear" w:color="auto" w:fill="282A36"/>
             <w:noWrap/>
             <w:tcMar>
               <w:top w:w="30" w:type="dxa"/>
@@ -174,7 +169,6 @@
         <w:tc>
           <w:tcPr>
             <w:tcW w:w="0" w:type="auto"/>
-            <w:shd w:val="clear" w:color="auto" w:fill="282A36"/>
             <w:noWrap/>
             <w:tcMar>
               <w:top w:w="30" w:type="dxa"/>
@@ -196,7 +190,6 @@
         <w:tc>
           <w:tcPr>
             <w:tcW w:w="0" w:type="auto"/>
-            <w:shd w:val="clear" w:color="auto" w:fill="282A36"/>
             <w:noWrap/>
             <w:tcMar>
               <w:top w:w="30" w:type="dxa"/>
@@ -220,7 +213,6 @@
         <w:tc>
           <w:tcPr>
             <w:tcW w:w="0" w:type="auto"/>
-            <w:shd w:val="clear" w:color="auto" w:fill="282A36"/>
             <w:noWrap/>
             <w:tcMar>
               <w:top w:w="30" w:type="dxa"/>
@@ -243,7 +235,6 @@
         <w:tc>
           <w:tcPr>
             <w:tcW w:w="0" w:type="auto"/>
-            <w:shd w:val="clear" w:color="auto" w:fill="282A36"/>
             <w:noWrap/>
             <w:tcMar>
               <w:top w:w="30" w:type="dxa"/>
@@ -266,7 +257,6 @@
         <w:tc>
           <w:tcPr>
             <w:tcW w:w="0" w:type="auto"/>
-            <w:shd w:val="clear" w:color="auto" w:fill="282A36"/>
             <w:noWrap/>
             <w:tcMar>
               <w:top w:w="30" w:type="dxa"/>
@@ -289,7 +279,6 @@
         <w:tc>
           <w:tcPr>
             <w:tcW w:w="0" w:type="auto"/>
-            <w:shd w:val="clear" w:color="auto" w:fill="282A36"/>
             <w:noWrap/>
             <w:tcMar>
               <w:top w:w="30" w:type="dxa"/>
@@ -312,7 +301,6 @@
         <w:tc>
           <w:tcPr>
             <w:tcW w:w="0" w:type="auto"/>
-            <w:shd w:val="clear" w:color="auto" w:fill="282A36"/>
             <w:noWrap/>
             <w:tcMar>
               <w:top w:w="30" w:type="dxa"/>
@@ -337,7 +325,6 @@
         <w:tc>
           <w:tcPr>
             <w:tcW w:w="0" w:type="auto"/>
-            <w:shd w:val="clear" w:color="auto" w:fill="282A36"/>
             <w:noWrap/>
             <w:tcMar>
               <w:top w:w="30" w:type="dxa"/>
@@ -360,7 +347,6 @@
         <w:tc>
           <w:tcPr>
             <w:tcW w:w="0" w:type="auto"/>
-            <w:shd w:val="clear" w:color="auto" w:fill="282A36"/>
             <w:noWrap/>
             <w:tcMar>
               <w:top w:w="30" w:type="dxa"/>
@@ -383,7 +369,6 @@
         <w:tc>
           <w:tcPr>
             <w:tcW w:w="0" w:type="auto"/>
-            <w:shd w:val="clear" w:color="auto" w:fill="282A36"/>
             <w:noWrap/>
             <w:tcMar>
               <w:top w:w="30" w:type="dxa"/>
@@ -406,7 +391,6 @@
         <w:tc>
           <w:tcPr>
             <w:tcW w:w="0" w:type="auto"/>
-            <w:shd w:val="clear" w:color="auto" w:fill="282A36"/>
             <w:noWrap/>
             <w:tcMar>
               <w:top w:w="30" w:type="dxa"/>
@@ -429,7 +413,6 @@
         <w:tc>
           <w:tcPr>
             <w:tcW w:w="0" w:type="auto"/>
-            <w:shd w:val="clear" w:color="auto" w:fill="282A36"/>
             <w:noWrap/>
             <w:tcMar>
               <w:top w:w="30" w:type="dxa"/>
@@ -454,7 +437,6 @@
         <w:tc>
           <w:tcPr>
             <w:tcW w:w="0" w:type="auto"/>
-            <w:shd w:val="clear" w:color="auto" w:fill="282A36"/>
             <w:noWrap/>
             <w:tcMar>
               <w:top w:w="30" w:type="dxa"/>
@@ -477,7 +459,6 @@
         <w:tc>
           <w:tcPr>
             <w:tcW w:w="0" w:type="auto"/>
-            <w:shd w:val="clear" w:color="auto" w:fill="282A36"/>
             <w:noWrap/>
             <w:tcMar>
               <w:top w:w="30" w:type="dxa"/>
@@ -500,7 +481,6 @@
         <w:tc>
           <w:tcPr>
             <w:tcW w:w="0" w:type="auto"/>
-            <w:shd w:val="clear" w:color="auto" w:fill="282A36"/>
             <w:noWrap/>
             <w:tcMar>
               <w:top w:w="30" w:type="dxa"/>
@@ -523,7 +503,6 @@
         <w:tc>
           <w:tcPr>
             <w:tcW w:w="0" w:type="auto"/>
-            <w:shd w:val="clear" w:color="auto" w:fill="282A36"/>
             <w:noWrap/>
             <w:tcMar>
               <w:top w:w="30" w:type="dxa"/>
@@ -546,7 +525,6 @@
         <w:tc>
           <w:tcPr>
             <w:tcW w:w="0" w:type="auto"/>
-            <w:shd w:val="clear" w:color="auto" w:fill="282A36"/>
             <w:noWrap/>
             <w:tcMar>
               <w:top w:w="30" w:type="dxa"/>
@@ -571,7 +549,6 @@
         <w:tc>
           <w:tcPr>
             <w:tcW w:w="0" w:type="auto"/>
-            <w:shd w:val="clear" w:color="auto" w:fill="282A36"/>
             <w:noWrap/>
             <w:tcMar>
               <w:top w:w="30" w:type="dxa"/>
@@ -594,7 +571,6 @@
         <w:tc>
           <w:tcPr>
             <w:tcW w:w="0" w:type="auto"/>
-            <w:shd w:val="clear" w:color="auto" w:fill="282A36"/>
             <w:noWrap/>
             <w:tcMar>
               <w:top w:w="30" w:type="dxa"/>
@@ -617,7 +593,6 @@
         <w:tc>
           <w:tcPr>
             <w:tcW w:w="0" w:type="auto"/>
-            <w:shd w:val="clear" w:color="auto" w:fill="282A36"/>
             <w:noWrap/>
             <w:tcMar>
               <w:top w:w="30" w:type="dxa"/>
@@ -640,7 +615,6 @@
         <w:tc>
           <w:tcPr>
             <w:tcW w:w="0" w:type="auto"/>
-            <w:shd w:val="clear" w:color="auto" w:fill="282A36"/>
             <w:noWrap/>
             <w:tcMar>
               <w:top w:w="30" w:type="dxa"/>
@@ -663,7 +637,6 @@
         <w:tc>
           <w:tcPr>
             <w:tcW w:w="0" w:type="auto"/>
-            <w:shd w:val="clear" w:color="auto" w:fill="282A36"/>
             <w:noWrap/>
             <w:tcMar>
               <w:top w:w="30" w:type="dxa"/>
@@ -688,7 +661,6 @@
         <w:tc>
           <w:tcPr>
             <w:tcW w:w="0" w:type="auto"/>
-            <w:shd w:val="clear" w:color="auto" w:fill="282A36"/>
             <w:noWrap/>
             <w:tcMar>
               <w:top w:w="30" w:type="dxa"/>
@@ -711,7 +683,6 @@
         <w:tc>
           <w:tcPr>
             <w:tcW w:w="0" w:type="auto"/>
-            <w:shd w:val="clear" w:color="auto" w:fill="282A36"/>
             <w:noWrap/>
             <w:tcMar>
               <w:top w:w="30" w:type="dxa"/>
@@ -734,7 +705,6 @@
         <w:tc>
           <w:tcPr>
             <w:tcW w:w="0" w:type="auto"/>
-            <w:shd w:val="clear" w:color="auto" w:fill="282A36"/>
             <w:noWrap/>
             <w:tcMar>
               <w:top w:w="30" w:type="dxa"/>
@@ -757,7 +727,6 @@
         <w:tc>
           <w:tcPr>
             <w:tcW w:w="0" w:type="auto"/>
-            <w:shd w:val="clear" w:color="auto" w:fill="282A36"/>
             <w:noWrap/>
             <w:tcMar>
               <w:top w:w="30" w:type="dxa"/>
@@ -780,7 +749,6 @@
         <w:tc>
           <w:tcPr>
             <w:tcW w:w="0" w:type="auto"/>
-            <w:shd w:val="clear" w:color="auto" w:fill="282A36"/>
             <w:noWrap/>
             <w:tcMar>
               <w:top w:w="30" w:type="dxa"/>
@@ -805,7 +773,6 @@
         <w:tc>
           <w:tcPr>
             <w:tcW w:w="0" w:type="auto"/>
-            <w:shd w:val="clear" w:color="auto" w:fill="282A36"/>
             <w:noWrap/>
             <w:tcMar>
               <w:top w:w="30" w:type="dxa"/>
@@ -828,7 +795,6 @@
         <w:tc>
           <w:tcPr>
             <w:tcW w:w="0" w:type="auto"/>
-            <w:shd w:val="clear" w:color="auto" w:fill="282A36"/>
             <w:noWrap/>
             <w:tcMar>
               <w:top w:w="30" w:type="dxa"/>
@@ -851,7 +817,6 @@
         <w:tc>
           <w:tcPr>
             <w:tcW w:w="0" w:type="auto"/>
-            <w:shd w:val="clear" w:color="auto" w:fill="282A36"/>
             <w:noWrap/>
             <w:tcMar>
               <w:top w:w="30" w:type="dxa"/>
@@ -874,7 +839,6 @@
         <w:tc>
           <w:tcPr>
             <w:tcW w:w="0" w:type="auto"/>
-            <w:shd w:val="clear" w:color="auto" w:fill="282A36"/>
             <w:noWrap/>
             <w:tcMar>
               <w:top w:w="30" w:type="dxa"/>
@@ -897,7 +861,6 @@
         <w:tc>
           <w:tcPr>
             <w:tcW w:w="0" w:type="auto"/>
-            <w:shd w:val="clear" w:color="auto" w:fill="282A36"/>
             <w:noWrap/>
             <w:tcMar>
               <w:top w:w="30" w:type="dxa"/>
@@ -922,7 +885,6 @@
         <w:tc>
           <w:tcPr>
             <w:tcW w:w="0" w:type="auto"/>
-            <w:shd w:val="clear" w:color="auto" w:fill="282A36"/>
             <w:noWrap/>
             <w:tcMar>
               <w:top w:w="30" w:type="dxa"/>
@@ -945,7 +907,6 @@
         <w:tc>
           <w:tcPr>
             <w:tcW w:w="0" w:type="auto"/>
-            <w:shd w:val="clear" w:color="auto" w:fill="282A36"/>
             <w:noWrap/>
             <w:tcMar>
               <w:top w:w="30" w:type="dxa"/>
@@ -968,7 +929,6 @@
         <w:tc>
           <w:tcPr>
             <w:tcW w:w="0" w:type="auto"/>
-            <w:shd w:val="clear" w:color="auto" w:fill="282A36"/>
             <w:noWrap/>
             <w:tcMar>
               <w:top w:w="30" w:type="dxa"/>
@@ -991,7 +951,6 @@
         <w:tc>
           <w:tcPr>
             <w:tcW w:w="0" w:type="auto"/>
-            <w:shd w:val="clear" w:color="auto" w:fill="282A36"/>
             <w:noWrap/>
             <w:tcMar>
               <w:top w:w="30" w:type="dxa"/>
@@ -1014,7 +973,6 @@
         <w:tc>
           <w:tcPr>
             <w:tcW w:w="0" w:type="auto"/>
-            <w:shd w:val="clear" w:color="auto" w:fill="282A36"/>
             <w:noWrap/>
             <w:tcMar>
               <w:top w:w="30" w:type="dxa"/>
@@ -1039,7 +997,6 @@
         <w:tc>
           <w:tcPr>
             <w:tcW w:w="0" w:type="auto"/>
-            <w:shd w:val="clear" w:color="auto" w:fill="282A36"/>
             <w:noWrap/>
             <w:tcMar>
               <w:top w:w="30" w:type="dxa"/>
@@ -1062,7 +1019,6 @@
         <w:tc>
           <w:tcPr>
             <w:tcW w:w="0" w:type="auto"/>
-            <w:shd w:val="clear" w:color="auto" w:fill="282A36"/>
             <w:noWrap/>
             <w:tcMar>
               <w:top w:w="30" w:type="dxa"/>
@@ -1085,7 +1041,6 @@
         <w:tc>
           <w:tcPr>
             <w:tcW w:w="0" w:type="auto"/>
-            <w:shd w:val="clear" w:color="auto" w:fill="282A36"/>
             <w:noWrap/>
             <w:tcMar>
               <w:top w:w="30" w:type="dxa"/>
@@ -1108,7 +1063,6 @@
         <w:tc>
           <w:tcPr>
             <w:tcW w:w="0" w:type="auto"/>
-            <w:shd w:val="clear" w:color="auto" w:fill="282A36"/>
             <w:noWrap/>
             <w:tcMar>
               <w:top w:w="30" w:type="dxa"/>
@@ -1131,7 +1085,6 @@
         <w:tc>
           <w:tcPr>
             <w:tcW w:w="0" w:type="auto"/>
-            <w:shd w:val="clear" w:color="auto" w:fill="282A36"/>
             <w:noWrap/>
             <w:tcMar>
               <w:top w:w="30" w:type="dxa"/>
@@ -1156,7 +1109,6 @@
         <w:tc>
           <w:tcPr>
             <w:tcW w:w="0" w:type="auto"/>
-            <w:shd w:val="clear" w:color="auto" w:fill="282A36"/>
             <w:noWrap/>
             <w:tcMar>
               <w:top w:w="30" w:type="dxa"/>
@@ -1179,7 +1131,6 @@
         <w:tc>
           <w:tcPr>
             <w:tcW w:w="0" w:type="auto"/>
-            <w:shd w:val="clear" w:color="auto" w:fill="282A36"/>
             <w:noWrap/>
             <w:tcMar>
               <w:top w:w="30" w:type="dxa"/>
@@ -1202,7 +1153,6 @@
         <w:tc>
           <w:tcPr>
             <w:tcW w:w="0" w:type="auto"/>
-            <w:shd w:val="clear" w:color="auto" w:fill="282A36"/>
             <w:noWrap/>
             <w:tcMar>
               <w:top w:w="30" w:type="dxa"/>
@@ -1225,7 +1175,6 @@
         <w:tc>
           <w:tcPr>
             <w:tcW w:w="0" w:type="auto"/>
-            <w:shd w:val="clear" w:color="auto" w:fill="282A36"/>
             <w:noWrap/>
             <w:tcMar>
               <w:top w:w="30" w:type="dxa"/>
@@ -1248,7 +1197,6 @@
         <w:tc>
           <w:tcPr>
             <w:tcW w:w="0" w:type="auto"/>
-            <w:shd w:val="clear" w:color="auto" w:fill="282A36"/>
             <w:noWrap/>
             <w:tcMar>
               <w:top w:w="30" w:type="dxa"/>
@@ -1273,7 +1221,6 @@
         <w:tc>
           <w:tcPr>
             <w:tcW w:w="0" w:type="auto"/>
-            <w:shd w:val="clear" w:color="auto" w:fill="282A36"/>
             <w:noWrap/>
             <w:tcMar>
               <w:top w:w="30" w:type="dxa"/>
@@ -1296,7 +1243,6 @@
         <w:tc>
           <w:tcPr>
             <w:tcW w:w="0" w:type="auto"/>
-            <w:shd w:val="clear" w:color="auto" w:fill="282A36"/>
             <w:noWrap/>
             <w:tcMar>
               <w:top w:w="30" w:type="dxa"/>
@@ -1325,7 +1271,6 @@
         <w:tc>
           <w:tcPr>
             <w:tcW w:w="0" w:type="auto"/>
-            <w:shd w:val="clear" w:color="auto" w:fill="282A36"/>
             <w:noWrap/>
             <w:tcMar>
               <w:top w:w="30" w:type="dxa"/>
@@ -1348,7 +1293,6 @@
         <w:tc>
           <w:tcPr>
             <w:tcW w:w="0" w:type="auto"/>
-            <w:shd w:val="clear" w:color="auto" w:fill="282A36"/>
             <w:noWrap/>
             <w:tcMar>
               <w:top w:w="30" w:type="dxa"/>
@@ -1371,7 +1315,6 @@
         <w:tc>
           <w:tcPr>
             <w:tcW w:w="0" w:type="auto"/>
-            <w:shd w:val="clear" w:color="auto" w:fill="282A36"/>
             <w:noWrap/>
             <w:tcMar>
               <w:top w:w="30" w:type="dxa"/>
@@ -1396,7 +1339,6 @@
         <w:tc>
           <w:tcPr>
             <w:tcW w:w="0" w:type="auto"/>
-            <w:shd w:val="clear" w:color="auto" w:fill="282A36"/>
             <w:noWrap/>
             <w:tcMar>
               <w:top w:w="30" w:type="dxa"/>
@@ -1419,7 +1361,6 @@
         <w:tc>
           <w:tcPr>
             <w:tcW w:w="0" w:type="auto"/>
-            <w:shd w:val="clear" w:color="auto" w:fill="282A36"/>
             <w:noWrap/>
             <w:tcMar>
               <w:top w:w="30" w:type="dxa"/>
@@ -1442,7 +1383,6 @@
         <w:tc>
           <w:tcPr>
             <w:tcW w:w="0" w:type="auto"/>
-            <w:shd w:val="clear" w:color="auto" w:fill="282A36"/>
             <w:noWrap/>
             <w:tcMar>
               <w:top w:w="30" w:type="dxa"/>
@@ -1465,7 +1405,6 @@
         <w:tc>
           <w:tcPr>
             <w:tcW w:w="0" w:type="auto"/>
-            <w:shd w:val="clear" w:color="auto" w:fill="282A36"/>
             <w:noWrap/>
             <w:tcMar>
               <w:top w:w="30" w:type="dxa"/>
@@ -1488,7 +1427,6 @@
         <w:tc>
           <w:tcPr>
             <w:tcW w:w="0" w:type="auto"/>
-            <w:shd w:val="clear" w:color="auto" w:fill="282A36"/>
             <w:noWrap/>
             <w:tcMar>
               <w:top w:w="30" w:type="dxa"/>
@@ -1513,7 +1451,6 @@
         <w:tc>
           <w:tcPr>
             <w:tcW w:w="0" w:type="auto"/>
-            <w:shd w:val="clear" w:color="auto" w:fill="282A36"/>
             <w:noWrap/>
             <w:tcMar>
               <w:top w:w="30" w:type="dxa"/>
@@ -1536,7 +1473,6 @@
         <w:tc>
           <w:tcPr>
             <w:tcW w:w="0" w:type="auto"/>
-            <w:shd w:val="clear" w:color="auto" w:fill="282A36"/>
             <w:noWrap/>
             <w:tcMar>
               <w:top w:w="30" w:type="dxa"/>
@@ -1559,7 +1495,6 @@
         <w:tc>
           <w:tcPr>
             <w:tcW w:w="0" w:type="auto"/>
-            <w:shd w:val="clear" w:color="auto" w:fill="282A36"/>
             <w:noWrap/>
             <w:tcMar>
               <w:top w:w="30" w:type="dxa"/>
@@ -1582,7 +1517,6 @@
         <w:tc>
           <w:tcPr>
             <w:tcW w:w="0" w:type="auto"/>
-            <w:shd w:val="clear" w:color="auto" w:fill="282A36"/>
             <w:noWrap/>
             <w:tcMar>
               <w:top w:w="30" w:type="dxa"/>
@@ -1605,7 +1539,6 @@
         <w:tc>
           <w:tcPr>
             <w:tcW w:w="0" w:type="auto"/>
-            <w:shd w:val="clear" w:color="auto" w:fill="282A36"/>
             <w:noWrap/>
             <w:tcMar>
               <w:top w:w="30" w:type="dxa"/>
@@ -1630,7 +1563,6 @@
         <w:tc>
           <w:tcPr>
             <w:tcW w:w="0" w:type="auto"/>
-            <w:shd w:val="clear" w:color="auto" w:fill="282A36"/>
             <w:noWrap/>
             <w:tcMar>
               <w:top w:w="30" w:type="dxa"/>
@@ -1653,7 +1585,6 @@
         <w:tc>
           <w:tcPr>
             <w:tcW w:w="0" w:type="auto"/>
-            <w:shd w:val="clear" w:color="auto" w:fill="282A36"/>
             <w:noWrap/>
             <w:tcMar>
               <w:top w:w="30" w:type="dxa"/>
@@ -1676,7 +1607,6 @@
         <w:tc>
           <w:tcPr>
             <w:tcW w:w="0" w:type="auto"/>
-            <w:shd w:val="clear" w:color="auto" w:fill="282A36"/>
             <w:noWrap/>
             <w:tcMar>
               <w:top w:w="30" w:type="dxa"/>
@@ -1699,7 +1629,6 @@
         <w:tc>
           <w:tcPr>
             <w:tcW w:w="0" w:type="auto"/>
-            <w:shd w:val="clear" w:color="auto" w:fill="282A36"/>
             <w:noWrap/>
             <w:tcMar>
               <w:top w:w="30" w:type="dxa"/>
@@ -1722,7 +1651,6 @@
         <w:tc>
           <w:tcPr>
             <w:tcW w:w="0" w:type="auto"/>
-            <w:shd w:val="clear" w:color="auto" w:fill="282A36"/>
             <w:noWrap/>
             <w:tcMar>
               <w:top w:w="30" w:type="dxa"/>
@@ -1747,7 +1675,6 @@
         <w:tc>
           <w:tcPr>
             <w:tcW w:w="0" w:type="auto"/>
-            <w:shd w:val="clear" w:color="auto" w:fill="282A36"/>
             <w:noWrap/>
             <w:tcMar>
               <w:top w:w="30" w:type="dxa"/>
@@ -1770,7 +1697,6 @@
         <w:tc>
           <w:tcPr>
             <w:tcW w:w="0" w:type="auto"/>
-            <w:shd w:val="clear" w:color="auto" w:fill="282A36"/>
             <w:noWrap/>
             <w:tcMar>
               <w:top w:w="30" w:type="dxa"/>
@@ -1793,7 +1719,6 @@
         <w:tc>
           <w:tcPr>
             <w:tcW w:w="0" w:type="auto"/>
-            <w:shd w:val="clear" w:color="auto" w:fill="282A36"/>
             <w:noWrap/>
             <w:tcMar>
               <w:top w:w="30" w:type="dxa"/>
@@ -1816,7 +1741,6 @@
         <w:tc>
           <w:tcPr>
             <w:tcW w:w="0" w:type="auto"/>
-            <w:shd w:val="clear" w:color="auto" w:fill="282A36"/>
             <w:noWrap/>
             <w:tcMar>
               <w:top w:w="30" w:type="dxa"/>
@@ -1839,7 +1763,6 @@
         <w:tc>
           <w:tcPr>
             <w:tcW w:w="0" w:type="auto"/>
-            <w:shd w:val="clear" w:color="auto" w:fill="282A36"/>
             <w:noWrap/>
             <w:tcMar>
               <w:top w:w="30" w:type="dxa"/>
@@ -1864,7 +1787,6 @@
         <w:tc>
           <w:tcPr>
             <w:tcW w:w="0" w:type="auto"/>
-            <w:shd w:val="clear" w:color="auto" w:fill="282A36"/>
             <w:noWrap/>
             <w:tcMar>
               <w:top w:w="30" w:type="dxa"/>
@@ -1887,7 +1809,6 @@
         <w:tc>
           <w:tcPr>
             <w:tcW w:w="0" w:type="auto"/>
-            <w:shd w:val="clear" w:color="auto" w:fill="282A36"/>
             <w:noWrap/>
             <w:tcMar>
               <w:top w:w="30" w:type="dxa"/>
@@ -1910,7 +1831,6 @@
         <w:tc>
           <w:tcPr>
             <w:tcW w:w="0" w:type="auto"/>
-            <w:shd w:val="clear" w:color="auto" w:fill="282A36"/>
             <w:noWrap/>
             <w:tcMar>
               <w:top w:w="30" w:type="dxa"/>
@@ -1933,7 +1853,6 @@
         <w:tc>
           <w:tcPr>
             <w:tcW w:w="0" w:type="auto"/>
-            <w:shd w:val="clear" w:color="auto" w:fill="282A36"/>
             <w:noWrap/>
             <w:tcMar>
               <w:top w:w="30" w:type="dxa"/>
@@ -1956,7 +1875,6 @@
         <w:tc>
           <w:tcPr>
             <w:tcW w:w="0" w:type="auto"/>
-            <w:shd w:val="clear" w:color="auto" w:fill="282A36"/>
             <w:noWrap/>
             <w:tcMar>
               <w:top w:w="30" w:type="dxa"/>
@@ -1981,7 +1899,6 @@
         <w:tc>
           <w:tcPr>
             <w:tcW w:w="0" w:type="auto"/>
-            <w:shd w:val="clear" w:color="auto" w:fill="282A36"/>
             <w:noWrap/>
             <w:tcMar>
               <w:top w:w="30" w:type="dxa"/>
@@ -2004,7 +1921,6 @@
         <w:tc>
           <w:tcPr>
             <w:tcW w:w="0" w:type="auto"/>
-            <w:shd w:val="clear" w:color="auto" w:fill="282A36"/>
             <w:noWrap/>
             <w:tcMar>
               <w:top w:w="30" w:type="dxa"/>
@@ -2027,7 +1943,6 @@
         <w:tc>
           <w:tcPr>
             <w:tcW w:w="0" w:type="auto"/>
-            <w:shd w:val="clear" w:color="auto" w:fill="282A36"/>
             <w:noWrap/>
             <w:tcMar>
               <w:top w:w="30" w:type="dxa"/>
@@ -2050,7 +1965,6 @@
         <w:tc>
           <w:tcPr>
             <w:tcW w:w="0" w:type="auto"/>
-            <w:shd w:val="clear" w:color="auto" w:fill="282A36"/>
             <w:noWrap/>
             <w:tcMar>
               <w:top w:w="30" w:type="dxa"/>
@@ -2073,7 +1987,6 @@
         <w:tc>
           <w:tcPr>
             <w:tcW w:w="0" w:type="auto"/>
-            <w:shd w:val="clear" w:color="auto" w:fill="282A36"/>
             <w:noWrap/>
             <w:tcMar>
               <w:top w:w="30" w:type="dxa"/>
@@ -2098,7 +2011,6 @@
         <w:tc>
           <w:tcPr>
             <w:tcW w:w="0" w:type="auto"/>
-            <w:shd w:val="clear" w:color="auto" w:fill="282A36"/>
             <w:noWrap/>
             <w:tcMar>
               <w:top w:w="30" w:type="dxa"/>
@@ -2121,7 +2033,6 @@
         <w:tc>
           <w:tcPr>
             <w:tcW w:w="0" w:type="auto"/>
-            <w:shd w:val="clear" w:color="auto" w:fill="282A36"/>
             <w:noWrap/>
             <w:tcMar>
               <w:top w:w="30" w:type="dxa"/>
@@ -2144,7 +2055,6 @@
         <w:tc>
           <w:tcPr>
             <w:tcW w:w="0" w:type="auto"/>
-            <w:shd w:val="clear" w:color="auto" w:fill="282A36"/>
             <w:noWrap/>
             <w:tcMar>
               <w:top w:w="30" w:type="dxa"/>
@@ -2167,7 +2077,6 @@
         <w:tc>
           <w:tcPr>
             <w:tcW w:w="0" w:type="auto"/>
-            <w:shd w:val="clear" w:color="auto" w:fill="282A36"/>
             <w:noWrap/>
             <w:tcMar>
               <w:top w:w="30" w:type="dxa"/>
@@ -2190,7 +2099,6 @@
         <w:tc>
           <w:tcPr>
             <w:tcW w:w="0" w:type="auto"/>
-            <w:shd w:val="clear" w:color="auto" w:fill="282A36"/>
             <w:vAlign w:val="center"/>
             <w:hideMark/>
           </w:tcPr>
@@ -2258,6 +2166,37 @@
       <w:r>
         <w:lastRenderedPageBreak/>
         <w:t>New FUNDS</w:t>
+      </w:r>
+    </w:p>
+    <w:p>
+      <w:r>
+        <w:t xml:space="preserve">Search </w:t>
+      </w:r>
+      <w:proofErr w:type="gramStart"/>
+      <w:r>
+        <w:t>fund</w:t>
+      </w:r>
+      <w:proofErr w:type="gramEnd"/>
+      <w:r>
+        <w:t xml:space="preserve"> and find out informatin about it. IOC has fund search options: </w:t>
+      </w:r>
+      <w:hyperlink r:id="rId6" w:history="1">
+        <w:r>
+          <w:rPr>
+            <w:rStyle w:val="Hyperlink"/>
+          </w:rPr>
+          <w:t>https://illinoiscomptroller.gov/financial-reports-data/data-sets-portals/fund-search</w:t>
+        </w:r>
+      </w:hyperlink>
+    </w:p>
+    <w:p>
+      <w:r>
+        <w:t xml:space="preserve">Then clicked “Learn More about This fund” to get the info pasted below. </w:t>
+      </w:r>
+    </w:p>
+    <w:p>
+      <w:r>
+        <w:t xml:space="preserve">The information for fund category must be added to the funds_ab_in.xlsx file! </w:t>
       </w:r>
     </w:p>
     <w:tbl>
@@ -2464,7 +2403,15 @@
             <w:hideMark/>
           </w:tcPr>
           <w:p>
-            <w:r>
+            <w:pPr>
+              <w:rPr>
+                <w:strike/>
+              </w:rPr>
+            </w:pPr>
+            <w:r>
+              <w:rPr>
+                <w:strike/>
+              </w:rPr>
               <w:t>0210</w:t>
             </w:r>
           </w:p>
@@ -2483,7 +2430,15 @@
             <w:hideMark/>
           </w:tcPr>
           <w:p>
-            <w:r>
+            <w:pPr>
+              <w:rPr>
+                <w:strike/>
+              </w:rPr>
+            </w:pPr>
+            <w:r>
+              <w:rPr>
+                <w:strike/>
+              </w:rPr>
               <w:t>ELECTRONIC NOTARIZATION</w:t>
             </w:r>
           </w:p>
@@ -2502,7 +2457,15 @@
             <w:hideMark/>
           </w:tcPr>
           <w:p>
-            <w:r>
+            <w:pPr>
+              <w:rPr>
+                <w:strike/>
+              </w:rPr>
+            </w:pPr>
+            <w:r>
+              <w:rPr>
+                <w:strike/>
+              </w:rPr>
               <w:t>Not New</w:t>
             </w:r>
           </w:p>
@@ -2521,7 +2484,15 @@
             <w:hideMark/>
           </w:tcPr>
           <w:p>
-            <w:r>
+            <w:pPr>
+              <w:rPr>
+                <w:strike/>
+              </w:rPr>
+            </w:pPr>
+            <w:r>
+              <w:rPr>
+                <w:strike/>
+              </w:rPr>
               <w:t>236627.27</w:t>
             </w:r>
           </w:p>
@@ -2803,7 +2774,15 @@
             <w:hideMark/>
           </w:tcPr>
           <w:p>
-            <w:r>
+            <w:pPr>
+              <w:rPr>
+                <w:strike/>
+              </w:rPr>
+            </w:pPr>
+            <w:r>
+              <w:rPr>
+                <w:strike/>
+              </w:rPr>
               <w:t>0254</w:t>
             </w:r>
           </w:p>
@@ -2822,7 +2801,15 @@
             <w:hideMark/>
           </w:tcPr>
           <w:p>
-            <w:r>
+            <w:pPr>
+              <w:rPr>
+                <w:strike/>
+              </w:rPr>
+            </w:pPr>
+            <w:r>
+              <w:rPr>
+                <w:strike/>
+              </w:rPr>
               <w:t>IL SECURE CHOICE ADMIN</w:t>
             </w:r>
           </w:p>
@@ -2841,7 +2828,15 @@
             <w:hideMark/>
           </w:tcPr>
           <w:p>
-            <w:r>
+            <w:pPr>
+              <w:rPr>
+                <w:strike/>
+              </w:rPr>
+            </w:pPr>
+            <w:r>
+              <w:rPr>
+                <w:strike/>
+              </w:rPr>
               <w:t>Not New – name difference</w:t>
             </w:r>
           </w:p>
@@ -2860,7 +2855,15 @@
             <w:hideMark/>
           </w:tcPr>
           <w:p>
-            <w:r>
+            <w:pPr>
+              <w:rPr>
+                <w:strike/>
+              </w:rPr>
+            </w:pPr>
+            <w:r>
+              <w:rPr>
+                <w:strike/>
+              </w:rPr>
               <w:t>0.00</w:t>
             </w:r>
           </w:p>
@@ -2885,7 +2888,15 @@
             <w:hideMark/>
           </w:tcPr>
           <w:p>
-            <w:r>
+            <w:pPr>
+              <w:rPr>
+                <w:strike/>
+              </w:rPr>
+            </w:pPr>
+            <w:r>
+              <w:rPr>
+                <w:strike/>
+              </w:rPr>
               <w:t>0268</w:t>
             </w:r>
           </w:p>
@@ -2904,7 +2915,15 @@
             <w:hideMark/>
           </w:tcPr>
           <w:p>
-            <w:r>
+            <w:pPr>
+              <w:rPr>
+                <w:strike/>
+              </w:rPr>
+            </w:pPr>
+            <w:r>
+              <w:rPr>
+                <w:strike/>
+              </w:rPr>
               <w:t>100 CLUB OF ILLINOIS</w:t>
             </w:r>
           </w:p>
@@ -2923,7 +2942,15 @@
             <w:hideMark/>
           </w:tcPr>
           <w:p>
-            <w:r>
+            <w:pPr>
+              <w:rPr>
+                <w:strike/>
+              </w:rPr>
+            </w:pPr>
+            <w:r>
+              <w:rPr>
+                <w:strike/>
+              </w:rPr>
               <w:t>Not New – Name Difference</w:t>
             </w:r>
           </w:p>
@@ -2942,7 +2969,15 @@
             <w:hideMark/>
           </w:tcPr>
           <w:p>
-            <w:r>
+            <w:pPr>
+              <w:rPr>
+                <w:strike/>
+              </w:rPr>
+            </w:pPr>
+            <w:r>
+              <w:rPr>
+                <w:strike/>
+              </w:rPr>
               <w:t>62210.47</w:t>
             </w:r>
           </w:p>
@@ -3141,7 +3176,15 @@
             <w:hideMark/>
           </w:tcPr>
           <w:p>
-            <w:r>
+            <w:pPr>
+              <w:rPr>
+                <w:strike/>
+              </w:rPr>
+            </w:pPr>
+            <w:r>
+              <w:rPr>
+                <w:strike/>
+              </w:rPr>
               <w:t>0358</w:t>
             </w:r>
           </w:p>
@@ -3160,7 +3203,15 @@
             <w:hideMark/>
           </w:tcPr>
           <w:p>
-            <w:r>
+            <w:pPr>
+              <w:rPr>
+                <w:strike/>
+              </w:rPr>
+            </w:pPr>
+            <w:r>
+              <w:rPr>
+                <w:strike/>
+              </w:rPr>
               <w:t>IL ABLE ACCOUNTS ADMIN</w:t>
             </w:r>
           </w:p>
@@ -3179,7 +3230,15 @@
             <w:hideMark/>
           </w:tcPr>
           <w:p>
-            <w:r>
+            <w:pPr>
+              <w:rPr>
+                <w:strike/>
+              </w:rPr>
+            </w:pPr>
+            <w:r>
+              <w:rPr>
+                <w:strike/>
+              </w:rPr>
               <w:t>Not New</w:t>
             </w:r>
           </w:p>
@@ -3198,7 +3257,15 @@
             <w:hideMark/>
           </w:tcPr>
           <w:p>
-            <w:r>
+            <w:pPr>
+              <w:rPr>
+                <w:strike/>
+              </w:rPr>
+            </w:pPr>
+            <w:r>
+              <w:rPr>
+                <w:strike/>
+              </w:rPr>
               <w:t>225.00</w:t>
             </w:r>
           </w:p>
@@ -3222,7 +3289,15 @@
             <w:vAlign w:val="center"/>
           </w:tcPr>
           <w:p>
-            <w:r>
+            <w:pPr>
+              <w:rPr>
+                <w:strike/>
+              </w:rPr>
+            </w:pPr>
+            <w:r>
+              <w:rPr>
+                <w:strike/>
+              </w:rPr>
               <w:t>0420</w:t>
             </w:r>
           </w:p>
@@ -3240,7 +3315,15 @@
             <w:vAlign w:val="center"/>
           </w:tcPr>
           <w:p>
-            <w:r>
+            <w:pPr>
+              <w:rPr>
+                <w:strike/>
+              </w:rPr>
+            </w:pPr>
+            <w:r>
+              <w:rPr>
+                <w:strike/>
+              </w:rPr>
               <w:t>PROFESSIONS LICENSURE</w:t>
             </w:r>
           </w:p>
@@ -3258,7 +3341,15 @@
             <w:vAlign w:val="center"/>
           </w:tcPr>
           <w:p>
-            <w:r>
+            <w:pPr>
+              <w:rPr>
+                <w:strike/>
+              </w:rPr>
+            </w:pPr>
+            <w:r>
+              <w:rPr>
+                <w:strike/>
+              </w:rPr>
               <w:t>Not New</w:t>
             </w:r>
           </w:p>
@@ -3275,7 +3366,13 @@
             </w:tcMar>
             <w:vAlign w:val="center"/>
           </w:tcPr>
-          <w:p/>
+          <w:p>
+            <w:pPr>
+              <w:rPr>
+                <w:strike/>
+              </w:rPr>
+            </w:pPr>
+          </w:p>
         </w:tc>
       </w:tr>
       <w:tr>
@@ -3380,6 +3477,7 @@
           </w:tcPr>
           <w:p>
             <w:r>
+              <w:lastRenderedPageBreak/>
               <w:t>0486</w:t>
             </w:r>
           </w:p>
@@ -3543,7 +3641,6 @@
           </w:tcPr>
           <w:p>
             <w:r>
-              <w:lastRenderedPageBreak/>
               <w:t>0494</w:t>
             </w:r>
           </w:p>
@@ -3795,7 +3892,15 @@
             <w:hideMark/>
           </w:tcPr>
           <w:p>
-            <w:r>
+            <w:pPr>
+              <w:rPr>
+                <w:strike/>
+              </w:rPr>
+            </w:pPr>
+            <w:r>
+              <w:rPr>
+                <w:strike/>
+              </w:rPr>
               <w:t>0591</w:t>
             </w:r>
           </w:p>
@@ -3814,7 +3919,15 @@
             <w:hideMark/>
           </w:tcPr>
           <w:p>
-            <w:r>
+            <w:pPr>
+              <w:rPr>
+                <w:strike/>
+              </w:rPr>
+            </w:pPr>
+            <w:r>
+              <w:rPr>
+                <w:strike/>
+              </w:rPr>
               <w:t>STAR BONDS SCHL IMPRV &amp; OPS</w:t>
             </w:r>
           </w:p>
@@ -3833,7 +3946,15 @@
             <w:hideMark/>
           </w:tcPr>
           <w:p>
-            <w:r>
+            <w:pPr>
+              <w:rPr>
+                <w:strike/>
+              </w:rPr>
+            </w:pPr>
+            <w:r>
+              <w:rPr>
+                <w:strike/>
+              </w:rPr>
               <w:t>Not new – name diff</w:t>
             </w:r>
           </w:p>
@@ -3852,7 +3973,15 @@
             <w:hideMark/>
           </w:tcPr>
           <w:p>
-            <w:r>
+            <w:pPr>
+              <w:rPr>
+                <w:strike/>
+              </w:rPr>
+            </w:pPr>
+            <w:r>
+              <w:rPr>
+                <w:strike/>
+              </w:rPr>
               <w:t>0.00</w:t>
             </w:r>
           </w:p>
@@ -3877,7 +4006,15 @@
             <w:hideMark/>
           </w:tcPr>
           <w:p>
-            <w:r>
+            <w:pPr>
+              <w:rPr>
+                <w:strike/>
+              </w:rPr>
+            </w:pPr>
+            <w:r>
+              <w:rPr>
+                <w:strike/>
+              </w:rPr>
               <w:t>0723</w:t>
             </w:r>
           </w:p>
@@ -3896,14 +4033,23 @@
             <w:hideMark/>
           </w:tcPr>
           <w:p>
+            <w:pPr>
+              <w:rPr>
+                <w:strike/>
+              </w:rPr>
+            </w:pPr>
             <w:commentRangeStart w:id="0"/>
             <w:r>
+              <w:rPr>
+                <w:strike/>
+              </w:rPr>
               <w:t>FIREARM ENFORCEMENT</w:t>
             </w:r>
             <w:commentRangeEnd w:id="0"/>
             <w:r>
               <w:rPr>
                 <w:rStyle w:val="CommentReference"/>
+                <w:strike/>
               </w:rPr>
               <w:commentReference w:id="0"/>
             </w:r>
@@ -3923,7 +4069,15 @@
             <w:hideMark/>
           </w:tcPr>
           <w:p>
-            <w:r>
+            <w:pPr>
+              <w:rPr>
+                <w:strike/>
+              </w:rPr>
+            </w:pPr>
+            <w:r>
+              <w:rPr>
+                <w:strike/>
+              </w:rPr>
               <w:t xml:space="preserve">Name Change? Was Called revocation enforcement? </w:t>
             </w:r>
             <w:r>
@@ -3933,6 +4087,12 @@
               </w:rPr>
               <w:t>LOOK THIS UP</w:t>
             </w:r>
+            <w:r>
+              <w:rPr>
+                <w:strike/>
+              </w:rPr>
+              <w:t xml:space="preserve"> Not New</w:t>
+            </w:r>
           </w:p>
         </w:tc>
         <w:tc>
@@ -3949,7 +4109,15 @@
             <w:hideMark/>
           </w:tcPr>
           <w:p>
-            <w:r>
+            <w:pPr>
+              <w:rPr>
+                <w:strike/>
+              </w:rPr>
+            </w:pPr>
+            <w:r>
+              <w:rPr>
+                <w:strike/>
+              </w:rPr>
               <w:t>1134821.31</w:t>
             </w:r>
           </w:p>
@@ -4173,6 +4341,1043 @@
     </w:p>
     <w:p/>
     <w:p/>
+    <w:p>
+      <w:r>
+        <w:lastRenderedPageBreak/>
+        <w:t>New Fund Information</w:t>
+      </w:r>
+    </w:p>
+    <w:p/>
+    <w:p>
+      <w:r>
+        <w:rPr>
+          <w:b/>
+          <w:bCs/>
+        </w:rPr>
+        <w:t>Official Fund Name:</w:t>
+      </w:r>
+      <w:r>
+        <w:br/>
+        <w:t>BUDGET RESERVE FOR IMMEDIATE DISBURSEMENTS AND GOVERNMENTAL EMERGENCIES</w:t>
+      </w:r>
+    </w:p>
+    <w:p>
+      <w:r>
+        <w:rPr>
+          <w:b/>
+          <w:bCs/>
+        </w:rPr>
+        <w:t>COMPTROLLER ASSIGNED FUND NUMBER: </w:t>
+      </w:r>
+      <w:r>
+        <w:t>0080</w:t>
+      </w:r>
+      <w:r>
+        <w:br/>
+      </w:r>
+      <w:r>
+        <w:rPr>
+          <w:b/>
+          <w:bCs/>
+        </w:rPr>
+        <w:t>ACTIVE/INACTIVE:</w:t>
+      </w:r>
+      <w:r>
+        <w:t> A</w:t>
+      </w:r>
+      <w:r>
+        <w:br/>
+      </w:r>
+      <w:r>
+        <w:rPr>
+          <w:b/>
+          <w:bCs/>
+        </w:rPr>
+        <w:t>EFFECTIVE DATE:</w:t>
+      </w:r>
+      <w:r>
+        <w:t> 6/16/25</w:t>
+      </w:r>
+      <w:r>
+        <w:br/>
+      </w:r>
+      <w:r>
+        <w:rPr>
+          <w:b/>
+          <w:bCs/>
+        </w:rPr>
+        <w:t>STATUTORY ORIGIN:</w:t>
+      </w:r>
+      <w:r>
+        <w:t> 20 ILCS 3005/10; 30 ILCS 105/5.1030</w:t>
+      </w:r>
+      <w:r>
+        <w:br/>
+      </w:r>
+      <w:r>
+        <w:rPr>
+          <w:b/>
+          <w:bCs/>
+        </w:rPr>
+        <w:t>ADMINISTERING AGENCY:</w:t>
+      </w:r>
+      <w:r>
+        <w:t> GOVERNOR'S OFF OF MGT &amp; BUDGET</w:t>
+      </w:r>
+      <w:r>
+        <w:br/>
+      </w:r>
+      <w:r>
+        <w:rPr>
+          <w:b/>
+          <w:bCs/>
+        </w:rPr>
+        <w:t>FUND CATEGORY:</w:t>
+      </w:r>
+      <w:r>
+        <w:t> SPECIAL STATE FUNDS</w:t>
+      </w:r>
+    </w:p>
+    <w:p>
+      <w:r>
+        <w:rPr>
+          <w:b/>
+          <w:bCs/>
+        </w:rPr>
+        <w:t>PURPOSE OF FUND:</w:t>
+      </w:r>
+      <w:r>
+        <w:br/>
+        <w:t xml:space="preserve">MAY RECEIVE REVENUE FROM ANY AUTHORIZED SOURCE, INCLUDING, BUT NOT LIMITED TO, GIFTS, GRANTS, AWARDS, TRANSFERS, AND APPROPRIATED DEPOSITS. MONEYS IN THE FUND </w:t>
+      </w:r>
+      <w:r>
+        <w:rPr>
+          <w:highlight w:val="yellow"/>
+        </w:rPr>
+        <w:t>SHALL BE USED TO PROVIDE SUPPLEMENTAL MONEYS FOR OTHER FUNDS HELD IN THE STATE TREASURY IN THE EVENT OF UNANTICIPATED DELAY</w:t>
+      </w:r>
+      <w:r>
+        <w:t>S IN OR FAILURES OF REVENUES WHEN SUPPLEMENTAL MONEYS ARE REQUIRED TO EFFECTUATE APPROPRIATIONS ENACTED BY THE GENERAL ASSEMBLY</w:t>
+      </w:r>
+    </w:p>
+    <w:p/>
+    <w:p>
+      <w:r>
+        <w:t>Environmental Justice Grant – 0213</w:t>
+      </w:r>
+    </w:p>
+    <w:p>
+      <w:pPr>
+        <w:pStyle w:val="ListParagraph"/>
+        <w:numPr>
+          <w:ilvl w:val="0"/>
+          <w:numId w:val="1"/>
+        </w:numPr>
+      </w:pPr>
+      <w:r>
+        <w:t xml:space="preserve">Not used yet. Info not on </w:t>
+      </w:r>
+      <w:proofErr w:type="gramStart"/>
+      <w:r>
+        <w:t>comptrollers</w:t>
+      </w:r>
+      <w:proofErr w:type="gramEnd"/>
+      <w:r>
+        <w:t xml:space="preserve"> website as of 7/17/2025</w:t>
+      </w:r>
+    </w:p>
+    <w:p>
+      <w:r>
+        <w:t>DOA FEDERAL INDIRECT COST</w:t>
+      </w:r>
+    </w:p>
+    <w:p>
+      <w:pPr>
+        <w:numPr>
+          <w:ilvl w:val="0"/>
+          <w:numId w:val="1"/>
+        </w:numPr>
+      </w:pPr>
+      <w:r>
+        <w:t xml:space="preserve">Not used yet. Info not on </w:t>
+      </w:r>
+      <w:proofErr w:type="gramStart"/>
+      <w:r>
+        <w:t>comptrollers</w:t>
+      </w:r>
+      <w:proofErr w:type="gramEnd"/>
+      <w:r>
+        <w:t xml:space="preserve"> website as of 7/17/2025</w:t>
+      </w:r>
+    </w:p>
+    <w:p>
+      <w:r>
+        <w:t>CARBON DIOXIDE SEQUESTRATION</w:t>
+      </w:r>
+    </w:p>
+    <w:p>
+      <w:pPr>
+        <w:numPr>
+          <w:ilvl w:val="0"/>
+          <w:numId w:val="1"/>
+        </w:numPr>
+      </w:pPr>
+      <w:r>
+        <w:t xml:space="preserve">Not used yet. Info not on </w:t>
+      </w:r>
+      <w:proofErr w:type="gramStart"/>
+      <w:r>
+        <w:t>comptrollers</w:t>
+      </w:r>
+      <w:proofErr w:type="gramEnd"/>
+      <w:r>
+        <w:t xml:space="preserve"> website as of 7/17/2025</w:t>
+      </w:r>
+    </w:p>
+    <w:p>
+      <w:r>
+        <w:t>UNCF SCHOLARSHIP</w:t>
+      </w:r>
+    </w:p>
+    <w:p>
+      <w:pPr>
+        <w:numPr>
+          <w:ilvl w:val="0"/>
+          <w:numId w:val="1"/>
+        </w:numPr>
+      </w:pPr>
+      <w:r>
+        <w:t xml:space="preserve">Not used yet. Info not on </w:t>
+      </w:r>
+      <w:proofErr w:type="gramStart"/>
+      <w:r>
+        <w:t>comptrollers</w:t>
+      </w:r>
+      <w:proofErr w:type="gramEnd"/>
+      <w:r>
+        <w:t xml:space="preserve"> website as of 7/17/2025</w:t>
+      </w:r>
+    </w:p>
+    <w:p>
+      <w:r>
+        <w:t>Water Resources</w:t>
+      </w:r>
+    </w:p>
+    <w:p>
+      <w:pPr>
+        <w:numPr>
+          <w:ilvl w:val="0"/>
+          <w:numId w:val="1"/>
+        </w:numPr>
+      </w:pPr>
+      <w:r>
+        <w:t xml:space="preserve">Not used yet. Info not on </w:t>
+      </w:r>
+      <w:proofErr w:type="gramStart"/>
+      <w:r>
+        <w:t>comptrollers</w:t>
+      </w:r>
+      <w:proofErr w:type="gramEnd"/>
+      <w:r>
+        <w:t xml:space="preserve"> website as of 7/17/2025</w:t>
+      </w:r>
+    </w:p>
+    <w:p>
+      <w:r>
+        <w:lastRenderedPageBreak/>
+        <w:t>Health Equity and Access</w:t>
+      </w:r>
+      <w:r>
+        <w:t xml:space="preserve"> - 0456</w:t>
+      </w:r>
+    </w:p>
+    <w:p>
+      <w:pPr>
+        <w:numPr>
+          <w:ilvl w:val="0"/>
+          <w:numId w:val="1"/>
+        </w:numPr>
+      </w:pPr>
+      <w:r>
+        <w:t xml:space="preserve">Not used yet. Info not on </w:t>
+      </w:r>
+      <w:proofErr w:type="gramStart"/>
+      <w:r>
+        <w:t>comptrollers</w:t>
+      </w:r>
+      <w:proofErr w:type="gramEnd"/>
+      <w:r>
+        <w:t xml:space="preserve"> website as of 7/17/2025</w:t>
+      </w:r>
+    </w:p>
+    <w:p/>
+    <w:p/>
+    <w:p/>
+    <w:p>
+      <w:r>
+        <w:rPr>
+          <w:b/>
+          <w:bCs/>
+        </w:rPr>
+        <w:t>Official Fund Name:</w:t>
+      </w:r>
+      <w:r>
+        <w:t xml:space="preserve"> </w:t>
+      </w:r>
+      <w:r>
+        <w:t>SUMMER EBT PROGRAM</w:t>
+      </w:r>
+    </w:p>
+    <w:p>
+      <w:r>
+        <w:rPr>
+          <w:b/>
+          <w:bCs/>
+        </w:rPr>
+        <w:t>COMPTROLLER ASSIGNED FUND NUMBER: </w:t>
+      </w:r>
+      <w:r>
+        <w:t>0280</w:t>
+      </w:r>
+      <w:r>
+        <w:br/>
+      </w:r>
+      <w:r>
+        <w:rPr>
+          <w:b/>
+          <w:bCs/>
+        </w:rPr>
+        <w:t>ACTIVE/INACTIVE:</w:t>
+      </w:r>
+      <w:r>
+        <w:t> A</w:t>
+      </w:r>
+      <w:r>
+        <w:br/>
+      </w:r>
+      <w:r>
+        <w:rPr>
+          <w:b/>
+          <w:bCs/>
+        </w:rPr>
+        <w:t>EFFECTIVE DATE:</w:t>
+      </w:r>
+      <w:r>
+        <w:t> 6/5/24</w:t>
+      </w:r>
+      <w:r>
+        <w:br/>
+      </w:r>
+      <w:r>
+        <w:rPr>
+          <w:b/>
+          <w:bCs/>
+        </w:rPr>
+        <w:t>STATUTORY ORIGIN:</w:t>
+      </w:r>
+      <w:r>
+        <w:t> 305 ILCS 5/12-4.13E</w:t>
+      </w:r>
+      <w:r>
+        <w:br/>
+      </w:r>
+      <w:r>
+        <w:rPr>
+          <w:b/>
+          <w:bCs/>
+        </w:rPr>
+        <w:t>ADMINISTERING AGENCY:</w:t>
+      </w:r>
+      <w:r>
+        <w:t> HUMAN SERVICES</w:t>
+      </w:r>
+      <w:r>
+        <w:br/>
+      </w:r>
+      <w:r>
+        <w:rPr>
+          <w:b/>
+          <w:bCs/>
+        </w:rPr>
+        <w:t>FUND CATEGORY:</w:t>
+      </w:r>
+      <w:r>
+        <w:t> FEDERAL TRUST FUNDS</w:t>
+      </w:r>
+    </w:p>
+    <w:p>
+      <w:r>
+        <w:rPr>
+          <w:b/>
+          <w:bCs/>
+        </w:rPr>
+        <w:t>PURPOSE OF FUND:</w:t>
+      </w:r>
+      <w:r>
+        <w:br/>
+        <w:t xml:space="preserve">IS CREATED AS A FEDERAL TRUST FUND IN THE STATE TREASURY. THE FUND IS ESTABLISHED TO RECIEVE MONEYS </w:t>
+      </w:r>
+      <w:r>
+        <w:rPr>
+          <w:highlight w:val="yellow"/>
+        </w:rPr>
+        <w:t>FROM THE FEDERAL GOVERNMENT FOR THE SUMMER EBT PROGRMA</w:t>
+      </w:r>
+      <w:r>
+        <w:t>. SUBJECT TO APPROPRIATION, MONEYS IN THE SUMMER EBT PROGRAM FUND SHALL BE EXPENDED BY THE DEPARTMENT OF HUMAN SERVICES ONLY FOR THOSE PURPOSES UNDER THE FEDERAL SUMMER ELECTRONIC BENEFIT TRANSFER PROGRAM FOR CHILDREN.</w:t>
+      </w:r>
+    </w:p>
+    <w:p>
+      <w:r>
+        <w:rPr>
+          <w:b/>
+          <w:bCs/>
+        </w:rPr>
+        <w:t>AGENCY NAMES WITH SPENDING AUTHORITY FROM FUND:</w:t>
+      </w:r>
+    </w:p>
+    <w:p>
+      <w:pPr>
+        <w:numPr>
+          <w:ilvl w:val="0"/>
+          <w:numId w:val="2"/>
+        </w:numPr>
+      </w:pPr>
+      <w:r>
+        <w:t>HUMAN SERVICES</w:t>
+      </w:r>
+    </w:p>
+    <w:p>
+      <w:pPr>
+        <w:rPr>
+          <w:b/>
+          <w:bCs/>
+        </w:rPr>
+      </w:pPr>
+    </w:p>
+    <w:p>
+      <w:pPr>
+        <w:rPr>
+          <w:b/>
+          <w:bCs/>
+        </w:rPr>
+      </w:pPr>
+    </w:p>
+    <w:p>
+      <w:r>
+        <w:rPr>
+          <w:b/>
+          <w:bCs/>
+        </w:rPr>
+        <w:t>Official Fund Name:</w:t>
+      </w:r>
+      <w:r>
+        <w:t xml:space="preserve"> </w:t>
+      </w:r>
+      <w:r>
+        <w:t>MEDICAL DEBT RELIEF PILOT PROGRAM</w:t>
+      </w:r>
+    </w:p>
+    <w:p>
+      <w:r>
+        <w:rPr>
+          <w:b/>
+          <w:bCs/>
+        </w:rPr>
+        <w:t>COMPTROLLER ASSIGNED FUND NUMBER: </w:t>
+      </w:r>
+      <w:r>
+        <w:t>0321</w:t>
+      </w:r>
+      <w:r>
+        <w:br/>
+      </w:r>
+      <w:r>
+        <w:rPr>
+          <w:b/>
+          <w:bCs/>
+        </w:rPr>
+        <w:t>ACTIVE/INACTIVE:</w:t>
+      </w:r>
+      <w:r>
+        <w:t> A</w:t>
+      </w:r>
+      <w:r>
+        <w:br/>
+      </w:r>
+      <w:r>
+        <w:rPr>
+          <w:b/>
+          <w:bCs/>
+        </w:rPr>
+        <w:t>EFFECTIVE DATE:</w:t>
+      </w:r>
+      <w:r>
+        <w:t> 7/2/24</w:t>
+      </w:r>
+      <w:r>
+        <w:br/>
+      </w:r>
+      <w:r>
+        <w:rPr>
+          <w:b/>
+          <w:bCs/>
+        </w:rPr>
+        <w:t>STATUTORY ORIGIN:</w:t>
+      </w:r>
+      <w:r>
+        <w:t> 30 ILCS 105/5.1015 &amp; 6Z-140</w:t>
+      </w:r>
+      <w:r>
+        <w:br/>
+      </w:r>
+      <w:r>
+        <w:rPr>
+          <w:b/>
+          <w:bCs/>
+        </w:rPr>
+        <w:t>ADMINISTERING AGENCY:</w:t>
+      </w:r>
+      <w:r>
+        <w:t> HEALTHCARE &amp; FAMILY SERVICES</w:t>
+      </w:r>
+      <w:r>
+        <w:br/>
+      </w:r>
+      <w:r>
+        <w:rPr>
+          <w:b/>
+          <w:bCs/>
+        </w:rPr>
+        <w:t>FUND CATEGORY:</w:t>
+      </w:r>
+      <w:r>
+        <w:t> SPECIAL STATE FUNDS</w:t>
+      </w:r>
+    </w:p>
+    <w:p>
+      <w:r>
+        <w:rPr>
+          <w:b/>
+          <w:bCs/>
+        </w:rPr>
+        <w:t>PURPOSE OF FUND:</w:t>
+      </w:r>
+      <w:r>
+        <w:br/>
+        <w:t xml:space="preserve">IS CREATED AS A SPECIAL FUND IN THE STATE TREASURY. ALL MONEYS IN THE </w:t>
+      </w:r>
+      <w:r>
+        <w:lastRenderedPageBreak/>
+        <w:t xml:space="preserve">FUND SHALL BE APPROPRIATED TO THE DEPARTMENT OF HEALTHCARE AND FAMILY SERVICES AND EXPENDED </w:t>
+      </w:r>
+      <w:r>
+        <w:rPr>
+          <w:highlight w:val="yellow"/>
+        </w:rPr>
+        <w:t>EXCLUSIVELY FOR THE MEDICAL DEBT RELIEF PILOT PROGRAM TO PROVIDE GRANT FUNDING TO A NONPROFIT MEDICAL DEBT RELIEF COORDINATOR</w:t>
+      </w:r>
+      <w:r>
+        <w:t xml:space="preserve"> TO BE USED TO DISCHARGE THE MDICAL DEBT OF ELIGIBLE RESIDENTS AS DEFINED IN THE MEDICAL DEBT RELIEF ACT. BASED ON A BUDGET APPROVED BY DEPARTMENT, THE GRANT </w:t>
+      </w:r>
+      <w:proofErr w:type="gramStart"/>
+      <w:r>
+        <w:t>FUNDING MAY</w:t>
+      </w:r>
+      <w:proofErr w:type="gramEnd"/>
+      <w:r>
+        <w:t xml:space="preserve"> ALSO BE USED FOR ANY ADMIN SERVICES PROVIDED BY THE NONPROFIT MEDICAL DEBT REL COORD TO DISCHRGE MED DEBT</w:t>
+      </w:r>
+    </w:p>
+    <w:p>
+      <w:r>
+        <w:rPr>
+          <w:b/>
+          <w:bCs/>
+        </w:rPr>
+        <w:t>AGENCY NAMES WITH SPENDING AUTHORITY FROM FUN</w:t>
+      </w:r>
+      <w:r>
+        <w:rPr>
+          <w:b/>
+          <w:bCs/>
+        </w:rPr>
+        <w:t>D</w:t>
+      </w:r>
+    </w:p>
+    <w:p>
+      <w:pPr>
+        <w:numPr>
+          <w:ilvl w:val="0"/>
+          <w:numId w:val="3"/>
+        </w:numPr>
+      </w:pPr>
+      <w:r>
+        <w:t>HEALTHCARE &amp; FAMILY SERVICES</w:t>
+      </w:r>
+    </w:p>
+    <w:p/>
+    <w:p/>
+    <w:p>
+      <w:r>
+        <w:rPr>
+          <w:b/>
+          <w:bCs/>
+        </w:rPr>
+        <w:t>Official Fund Name:</w:t>
+      </w:r>
+      <w:r>
+        <w:t xml:space="preserve"> </w:t>
+      </w:r>
+      <w:r>
+        <w:t>UNCF SCHOLARSHIP</w:t>
+      </w:r>
+    </w:p>
+    <w:p>
+      <w:r>
+        <w:rPr>
+          <w:b/>
+          <w:bCs/>
+        </w:rPr>
+        <w:t>COMPTROLLER ASSIGNED FUND NUMBER: </w:t>
+      </w:r>
+      <w:r>
+        <w:t>0486</w:t>
+      </w:r>
+      <w:r>
+        <w:br/>
+      </w:r>
+      <w:r>
+        <w:rPr>
+          <w:b/>
+          <w:bCs/>
+        </w:rPr>
+        <w:t>ACTIVE/INACTIVE:</w:t>
+      </w:r>
+      <w:r>
+        <w:t> A</w:t>
+      </w:r>
+      <w:r>
+        <w:br/>
+      </w:r>
+      <w:r>
+        <w:rPr>
+          <w:b/>
+          <w:bCs/>
+        </w:rPr>
+        <w:t>EFFECTIVE DATE:</w:t>
+      </w:r>
+      <w:r>
+        <w:t> 7/28/23</w:t>
+      </w:r>
+      <w:r>
+        <w:br/>
+      </w:r>
+      <w:r>
+        <w:rPr>
+          <w:b/>
+          <w:bCs/>
+        </w:rPr>
+        <w:t>STATUTORY ORIGIN:</w:t>
+      </w:r>
+      <w:r>
+        <w:t> 20 ILCS 1605/21.15; 30 ILCS 105/5.990</w:t>
+      </w:r>
+      <w:r>
+        <w:br/>
+      </w:r>
+      <w:r>
+        <w:rPr>
+          <w:b/>
+          <w:bCs/>
+        </w:rPr>
+        <w:t>ADMINISTERING AGENCY:</w:t>
+      </w:r>
+      <w:r>
+        <w:t> STATE LOTTERY</w:t>
+      </w:r>
+      <w:r>
+        <w:br/>
+      </w:r>
+      <w:r>
+        <w:rPr>
+          <w:b/>
+          <w:bCs/>
+        </w:rPr>
+        <w:t>FUND CATEGORY:</w:t>
+      </w:r>
+      <w:r>
+        <w:t> SPECIAL STATE FUNDS</w:t>
+      </w:r>
+    </w:p>
+    <w:p>
+      <w:r>
+        <w:rPr>
+          <w:b/>
+          <w:bCs/>
+        </w:rPr>
+        <w:t>PURPOSE OF FUND:</w:t>
+      </w:r>
+      <w:r>
+        <w:br/>
+        <w:t xml:space="preserve">THE NET REVENUE FROM THE SPECIAL INSTANT SCRATCH-OFF GAME SOLD FOR THE BENEFIT OF THE UNITED NEGRO COLLEGE FUND ILLINOIS IN SUPPORT OF EDUCATION SCHOLARSHIPS TO UNIVERSITY AND COLLEGE STUDENTS SHALL BE DEPOSITED INTO THE FUND FOR APPROPRIATION BY THE GENERAL ASSEMBLY </w:t>
+      </w:r>
+      <w:r>
+        <w:rPr>
+          <w:highlight w:val="yellow"/>
+        </w:rPr>
+        <w:t>SOLELY TO THE STUDENT ASSISTANCE COMMISSION FOR THE PURPOSE OF FUNDING UNCF ILLINOIS SCHOLARSHIP AWARDS</w:t>
+      </w:r>
+      <w:r>
+        <w:t xml:space="preserve"> TO UNIVERSITY AND COLLEGE STUDENTS. FUNDING SHALL BE USED SOLELY FOR SCHOLARSHIP AWARDS AND NOT TO COVER ANY ADMINISTRATIVE COSTS OF THE UNITED NEGRO COLLEGE FUND, INC.</w:t>
+      </w:r>
+    </w:p>
+    <w:p>
+      <w:r>
+        <w:rPr>
+          <w:b/>
+          <w:bCs/>
+        </w:rPr>
+        <w:t>AGENCY NAMES WITH SPENDING AUTHORITY FROM FUND:</w:t>
+      </w:r>
+    </w:p>
+    <w:p>
+      <w:pPr>
+        <w:numPr>
+          <w:ilvl w:val="0"/>
+          <w:numId w:val="4"/>
+        </w:numPr>
+      </w:pPr>
+      <w:r>
+        <w:t>IL STUDENT ASSISTANCE COMM</w:t>
+      </w:r>
+    </w:p>
+    <w:p>
+      <w:pPr>
+        <w:numPr>
+          <w:ilvl w:val="0"/>
+          <w:numId w:val="4"/>
+        </w:numPr>
+      </w:pPr>
+      <w:r>
+        <w:t>STATUTORY TRANSFERS</w:t>
+      </w:r>
+    </w:p>
+    <w:p>
+      <w:pPr>
+        <w:numPr>
+          <w:ilvl w:val="0"/>
+          <w:numId w:val="4"/>
+        </w:numPr>
+      </w:pPr>
+      <w:r>
+        <w:t>TREASURER</w:t>
+      </w:r>
+    </w:p>
+    <w:p/>
+    <w:p>
+      <w:r>
+        <w:rPr>
+          <w:b/>
+          <w:bCs/>
+        </w:rPr>
+        <w:t>Official Fund Name:</w:t>
+      </w:r>
+      <w:r>
+        <w:t xml:space="preserve"> </w:t>
+      </w:r>
+      <w:r>
+        <w:t>ILLINOIS DREAM</w:t>
+      </w:r>
+    </w:p>
+    <w:p>
+      <w:r>
+        <w:rPr>
+          <w:b/>
+          <w:bCs/>
+        </w:rPr>
+        <w:t>COMPTROLLER ASSIGNED FUND NUMBER: </w:t>
+      </w:r>
+      <w:r>
+        <w:t>0487</w:t>
+      </w:r>
+      <w:r>
+        <w:br/>
+      </w:r>
+      <w:r>
+        <w:rPr>
+          <w:b/>
+          <w:bCs/>
+        </w:rPr>
+        <w:t>ACTIVE/INACTIVE:</w:t>
+      </w:r>
+      <w:r>
+        <w:t> A</w:t>
+      </w:r>
+      <w:r>
+        <w:br/>
+      </w:r>
+      <w:r>
+        <w:rPr>
+          <w:b/>
+          <w:bCs/>
+        </w:rPr>
+        <w:t>EFFECTIVE DATE:</w:t>
+      </w:r>
+      <w:r>
+        <w:t> 7/28/23</w:t>
+      </w:r>
+      <w:r>
+        <w:br/>
+      </w:r>
+      <w:r>
+        <w:rPr>
+          <w:b/>
+          <w:bCs/>
+        </w:rPr>
+        <w:t>STATUTORY ORIGIN:</w:t>
+      </w:r>
+      <w:r>
+        <w:t> 20 ILCS 1605/21.16; 30 ILCS 105/5.991</w:t>
+      </w:r>
+      <w:r>
+        <w:br/>
+      </w:r>
+      <w:r>
+        <w:rPr>
+          <w:b/>
+          <w:bCs/>
+        </w:rPr>
+        <w:t>ADMINISTERING AGENCY:</w:t>
+      </w:r>
+      <w:r>
+        <w:t> STATE LOTTERY</w:t>
+      </w:r>
+      <w:r>
+        <w:br/>
+      </w:r>
+      <w:r>
+        <w:rPr>
+          <w:b/>
+          <w:bCs/>
+        </w:rPr>
+        <w:t>FUND CATEGORY:</w:t>
+      </w:r>
+      <w:r>
+        <w:t> SPECIAL STATE FUNDS</w:t>
+      </w:r>
+    </w:p>
+    <w:p>
+      <w:r>
+        <w:rPr>
+          <w:b/>
+          <w:bCs/>
+        </w:rPr>
+        <w:t>PURPOSE OF FUND:</w:t>
+      </w:r>
+      <w:r>
+        <w:br/>
+      </w:r>
+      <w:r>
+        <w:rPr>
+          <w:highlight w:val="yellow"/>
+        </w:rPr>
+        <w:t>THE NEW REVENUE FROM THE ILLINOIS DREAM SCRATCH-OFF GAME</w:t>
+      </w:r>
+      <w:r>
+        <w:t xml:space="preserve"> SHALL BE DEPOSITED INTO THE FUND. SUBJECT TO APPROPRIATION, MONEY IN THE ILLINOIS DREAM FUND </w:t>
+      </w:r>
+      <w:r>
+        <w:rPr>
+          <w:highlight w:val="yellow"/>
+        </w:rPr>
+        <w:t>SHALL BE USED TO ASSIST IN FUNDING SCHOLARSHIPS AND OTHER STATUTORY RESPONSIBLITIES OF THE ILLINOIS DREAM FUND</w:t>
+      </w:r>
+      <w:r>
+        <w:t xml:space="preserve"> COMMISSION.</w:t>
+      </w:r>
+    </w:p>
+    <w:p>
+      <w:r>
+        <w:rPr>
+          <w:b/>
+          <w:bCs/>
+        </w:rPr>
+        <w:t>AGENCY NAMES WITH SPENDING AUTHORITY FROM FUND:</w:t>
+      </w:r>
+    </w:p>
+    <w:p>
+      <w:pPr>
+        <w:numPr>
+          <w:ilvl w:val="0"/>
+          <w:numId w:val="5"/>
+        </w:numPr>
+      </w:pPr>
+      <w:r>
+        <w:t>IL STUDENT ASSISTANCE COMM</w:t>
+      </w:r>
+    </w:p>
+    <w:p>
+      <w:pPr>
+        <w:numPr>
+          <w:ilvl w:val="0"/>
+          <w:numId w:val="5"/>
+        </w:numPr>
+      </w:pPr>
+      <w:r>
+        <w:t>STATUTORY TRANSFERS</w:t>
+      </w:r>
+    </w:p>
+    <w:p/>
+    <w:p>
+      <w:r>
+        <w:rPr>
+          <w:b/>
+          <w:bCs/>
+        </w:rPr>
+        <w:t>Official Fund Name:</w:t>
+      </w:r>
+      <w:r>
+        <w:t xml:space="preserve"> </w:t>
+      </w:r>
+      <w:r>
+        <w:t>ILLINOIS AMERICA 250 COMMISSION TRUST</w:t>
+      </w:r>
+    </w:p>
+    <w:p>
+      <w:r>
+        <w:rPr>
+          <w:b/>
+          <w:bCs/>
+        </w:rPr>
+        <w:t>COMPTROLLER ASSIGNED FUND NUMBER: </w:t>
+      </w:r>
+      <w:r>
+        <w:t>0526</w:t>
+      </w:r>
+      <w:r>
+        <w:br/>
+      </w:r>
+      <w:r>
+        <w:rPr>
+          <w:b/>
+          <w:bCs/>
+        </w:rPr>
+        <w:t>ACTIVE/INACTIVE:</w:t>
+      </w:r>
+      <w:r>
+        <w:t> A</w:t>
+      </w:r>
+      <w:r>
+        <w:br/>
+      </w:r>
+      <w:r>
+        <w:rPr>
+          <w:b/>
+          <w:bCs/>
+        </w:rPr>
+        <w:t>EFFECTIVE DATE:</w:t>
+      </w:r>
+      <w:r>
+        <w:t> 8/26/24</w:t>
+      </w:r>
+      <w:r>
+        <w:br/>
+      </w:r>
+      <w:r>
+        <w:rPr>
+          <w:b/>
+          <w:bCs/>
+        </w:rPr>
+        <w:t>STATUTORY ORIGIN:</w:t>
+      </w:r>
+      <w:r>
+        <w:t> 20 ILCS 4114/35</w:t>
+      </w:r>
+      <w:r>
+        <w:br/>
+      </w:r>
+      <w:r>
+        <w:rPr>
+          <w:b/>
+          <w:bCs/>
+        </w:rPr>
+        <w:t>ADMINISTERING AGENCY:</w:t>
+      </w:r>
+      <w:r>
+        <w:t> NATURAL RESOURCES</w:t>
+      </w:r>
+      <w:r>
+        <w:br/>
+      </w:r>
+      <w:r>
+        <w:rPr>
+          <w:b/>
+          <w:bCs/>
+        </w:rPr>
+        <w:t>FUND CATEGORY:</w:t>
+      </w:r>
+      <w:r>
+        <w:t> STATE TRUST FUNDS</w:t>
+      </w:r>
+    </w:p>
+    <w:p>
+      <w:r>
+        <w:rPr>
+          <w:b/>
+          <w:bCs/>
+        </w:rPr>
+        <w:t>PURPOSE OF FUND:</w:t>
+      </w:r>
+      <w:r>
+        <w:br/>
+        <w:t xml:space="preserve">CREATED AS A NON-APPROPRIATED </w:t>
+      </w:r>
+      <w:r>
+        <w:rPr>
+          <w:highlight w:val="yellow"/>
+        </w:rPr>
+        <w:t>TRUST FUND TO BE HELD OUTSIDE THE STATE TREASURY,</w:t>
+      </w:r>
+      <w:r>
+        <w:t xml:space="preserve"> WITH THE STATE TREASURER AS CUSTODIAN. THE COMMISSION MAY ACCEPT MONETARY GIFTS AND GRANTS FROM ANY PUBLIC OR PRIVATE SOURCE, WHICH SHALL BE HELD IN THE FUND. ALL GIFTS, GRANTS, ASSETS, FUNDS, OR MONEY RECEIVED BY THE COMMISSION UNDER THIS ACT SHALL BE DEPOSITED AND HELD IN THE FUND BY THE STATE TREASURER AS EX OFFICIO CUSTODIAN SEPARATE AND APART FROM ALL PUBLIC MONEY OR </w:t>
+      </w:r>
+      <w:r>
+        <w:lastRenderedPageBreak/>
+        <w:t>FUNDS OF THIS STATE AND SHALL BE ADMINISTERED BY THE COMMISSION EXCLUSIVELY FOR THE PURPSES SET FORTH IN THIS ACT.</w:t>
+      </w:r>
+    </w:p>
+    <w:p>
+      <w:r>
+        <w:rPr>
+          <w:b/>
+          <w:bCs/>
+        </w:rPr>
+        <w:t>AGENCY NAMES WITH SPENDING AUTHORITY FROM FUND:</w:t>
+      </w:r>
+    </w:p>
+    <w:p>
+      <w:pPr>
+        <w:numPr>
+          <w:ilvl w:val="0"/>
+          <w:numId w:val="6"/>
+        </w:numPr>
+      </w:pPr>
+      <w:r>
+        <w:t>NATURAL RESOURCES</w:t>
+      </w:r>
+    </w:p>
+    <w:p>
+      <w:pPr>
+        <w:numPr>
+          <w:ilvl w:val="0"/>
+          <w:numId w:val="6"/>
+        </w:numPr>
+      </w:pPr>
+      <w:r>
+        <w:t>TREASURER</w:t>
+      </w:r>
+    </w:p>
     <w:p/>
     <w:sectPr>
       <w:pgSz w:w="12240" w:h="15840"/>
@@ -4221,6 +5426,886 @@
 <w16cid:commentsIds xmlns:wpc="http://schemas.microsoft.com/office/word/2010/wordprocessingCanvas" xmlns:cx="http://schemas.microsoft.com/office/drawing/2014/chartex" xmlns:cx1="http://schemas.microsoft.com/office/drawing/2015/9/8/chartex" xmlns:cx2="http://schemas.microsoft.com/office/drawing/2015/10/21/chartex" xmlns:cx3="http://schemas.microsoft.com/office/drawing/2016/5/9/chartex" xmlns:cx4="http://schemas.microsoft.com/office/drawing/2016/5/10/chartex" xmlns:cx5="http://schemas.microsoft.com/office/drawing/2016/5/11/chartex" xmlns:cx6="http://schemas.microsoft.com/office/drawing/2016/5/12/chartex" xmlns:cx7="http://schemas.microsoft.com/office/drawing/2016/5/13/chartex" xmlns:cx8="http://schemas.microsoft.com/office/drawing/2016/5/14/chartex" xmlns:mc="http://schemas.openxmlformats.org/markup-compatibility/2006" xmlns:aink="http://schemas.microsoft.com/office/drawing/2016/ink" xmlns:am3d="http://schemas.microsoft.com/office/drawing/2017/model3d" xmlns:o="urn:schemas-microsoft-com:office:office" xmlns:oel="http://schemas.microsoft.com/office/2019/extlst" xmlns:r="http://schemas.openxmlformats.org/officeDocument/2006/relationships" xmlns:m="http://schemas.openxmlformats.org/officeDocument/2006/math" xmlns:v="urn:schemas-microsoft-com:vml" xmlns:wp14="http://schemas.microsoft.com/office/word/2010/wordprocessingDrawing" xmlns:wp="http://schemas.openxmlformats.org/drawingml/2006/wordprocessingDrawing" xmlns:w10="urn:schemas-microsoft-com:office:word" xmlns:w="http://schemas.openxmlformats.org/wordprocessingml/2006/main" xmlns:w14="http://schemas.microsoft.com/office/word/2010/wordml" xmlns:w15="http://schemas.microsoft.com/office/word/2012/wordml" xmlns:w16cex="http://schemas.microsoft.com/office/word/2018/wordml/cex" xmlns:w16cid="http://schemas.microsoft.com/office/word/2016/wordml/cid" xmlns:w16="http://schemas.microsoft.com/office/word/2018/wordml" xmlns:w16du="http://schemas.microsoft.com/office/word/2023/wordml/word16du" xmlns:w16sdtdh="http://schemas.microsoft.com/office/word/2020/wordml/sdtdatahash" xmlns:w16sdtfl="http://schemas.microsoft.com/office/word/2024/wordml/sdtformatlock" xmlns:w16se="http://schemas.microsoft.com/office/word/2015/wordml/symex" xmlns:wpg="http://schemas.microsoft.com/office/word/2010/wordprocessingGroup" xmlns:wpi="http://schemas.microsoft.com/office/word/2010/wordprocessingInk" xmlns:wne="http://schemas.microsoft.com/office/word/2006/wordml" xmlns:wps="http://schemas.microsoft.com/office/word/2010/wordprocessingShape" mc:Ignorable="w14 w15 w16se w16cid w16 w16cex w16sdtdh w16sdtfl w16du wp14">
   <w16cid:commentId w16cid:paraId="6EF20400" w16cid:durableId="35FBD234"/>
 </w16cid:commentsIds>
+</file>
+
+<file path=word/numbering.xml><?xml version="1.0" encoding="utf-8"?>
+<w:numbering xmlns:wpc="http://schemas.microsoft.com/office/word/2010/wordprocessingCanvas" xmlns:cx="http://schemas.microsoft.com/office/drawing/2014/chartex" xmlns:cx1="http://schemas.microsoft.com/office/drawing/2015/9/8/chartex" xmlns:cx2="http://schemas.microsoft.com/office/drawing/2015/10/21/chartex" xmlns:cx3="http://schemas.microsoft.com/office/drawing/2016/5/9/chartex" xmlns:cx4="http://schemas.microsoft.com/office/drawing/2016/5/10/chartex" xmlns:cx5="http://schemas.microsoft.com/office/drawing/2016/5/11/chartex" xmlns:cx6="http://schemas.microsoft.com/office/drawing/2016/5/12/chartex" xmlns:cx7="http://schemas.microsoft.com/office/drawing/2016/5/13/chartex" xmlns:cx8="http://schemas.microsoft.com/office/drawing/2016/5/14/chartex" xmlns:mc="http://schemas.openxmlformats.org/markup-compatibility/2006" xmlns:aink="http://schemas.microsoft.com/office/drawing/2016/ink" xmlns:am3d="http://schemas.microsoft.com/office/drawing/2017/model3d" xmlns:o="urn:schemas-microsoft-com:office:office" xmlns:oel="http://schemas.microsoft.com/office/2019/extlst" xmlns:r="http://schemas.openxmlformats.org/officeDocument/2006/relationships" xmlns:m="http://schemas.openxmlformats.org/officeDocument/2006/math" xmlns:v="urn:schemas-microsoft-com:vml" xmlns:wp14="http://schemas.microsoft.com/office/word/2010/wordprocessingDrawing" xmlns:wp="http://schemas.openxmlformats.org/drawingml/2006/wordprocessingDrawing" xmlns:w10="urn:schemas-microsoft-com:office:word" xmlns:w="http://schemas.openxmlformats.org/wordprocessingml/2006/main" xmlns:w14="http://schemas.microsoft.com/office/word/2010/wordml" xmlns:w15="http://schemas.microsoft.com/office/word/2012/wordml" xmlns:w16cex="http://schemas.microsoft.com/office/word/2018/wordml/cex" xmlns:w16cid="http://schemas.microsoft.com/office/word/2016/wordml/cid" xmlns:w16="http://schemas.microsoft.com/office/word/2018/wordml" xmlns:w16du="http://schemas.microsoft.com/office/word/2023/wordml/word16du" xmlns:w16sdtdh="http://schemas.microsoft.com/office/word/2020/wordml/sdtdatahash" xmlns:w16sdtfl="http://schemas.microsoft.com/office/word/2024/wordml/sdtformatlock" xmlns:w16se="http://schemas.microsoft.com/office/word/2015/wordml/symex" xmlns:wpg="http://schemas.microsoft.com/office/word/2010/wordprocessingGroup" xmlns:wpi="http://schemas.microsoft.com/office/word/2010/wordprocessingInk" xmlns:wne="http://schemas.microsoft.com/office/word/2006/wordml" xmlns:wps="http://schemas.microsoft.com/office/word/2010/wordprocessingShape" mc:Ignorable="w14 w15 w16se w16cid w16 w16cex w16sdtdh w16sdtfl w16du wp14">
+  <w:abstractNum w:abstractNumId="0" w15:restartNumberingAfterBreak="0">
+    <w:nsid w:val="181B7111"/>
+    <w:multiLevelType w:val="multilevel"/>
+    <w:tmpl w:val="DBF2913A"/>
+    <w:lvl w:ilvl="0">
+      <w:start w:val="1"/>
+      <w:numFmt w:val="bullet"/>
+      <w:lvlText w:val=""/>
+      <w:lvlJc w:val="left"/>
+      <w:pPr>
+        <w:tabs>
+          <w:tab w:val="num" w:pos="720"/>
+        </w:tabs>
+        <w:ind w:left="720" w:hanging="360"/>
+      </w:pPr>
+      <w:rPr>
+        <w:rFonts w:ascii="Symbol" w:hAnsi="Symbol" w:hint="default"/>
+        <w:sz w:val="20"/>
+      </w:rPr>
+    </w:lvl>
+    <w:lvl w:ilvl="1" w:tentative="1">
+      <w:start w:val="1"/>
+      <w:numFmt w:val="bullet"/>
+      <w:lvlText w:val="o"/>
+      <w:lvlJc w:val="left"/>
+      <w:pPr>
+        <w:tabs>
+          <w:tab w:val="num" w:pos="1440"/>
+        </w:tabs>
+        <w:ind w:left="1440" w:hanging="360"/>
+      </w:pPr>
+      <w:rPr>
+        <w:rFonts w:ascii="Courier New" w:hAnsi="Courier New" w:hint="default"/>
+        <w:sz w:val="20"/>
+      </w:rPr>
+    </w:lvl>
+    <w:lvl w:ilvl="2" w:tentative="1">
+      <w:start w:val="1"/>
+      <w:numFmt w:val="bullet"/>
+      <w:lvlText w:val=""/>
+      <w:lvlJc w:val="left"/>
+      <w:pPr>
+        <w:tabs>
+          <w:tab w:val="num" w:pos="2160"/>
+        </w:tabs>
+        <w:ind w:left="2160" w:hanging="360"/>
+      </w:pPr>
+      <w:rPr>
+        <w:rFonts w:ascii="Wingdings" w:hAnsi="Wingdings" w:hint="default"/>
+        <w:sz w:val="20"/>
+      </w:rPr>
+    </w:lvl>
+    <w:lvl w:ilvl="3" w:tentative="1">
+      <w:start w:val="1"/>
+      <w:numFmt w:val="bullet"/>
+      <w:lvlText w:val=""/>
+      <w:lvlJc w:val="left"/>
+      <w:pPr>
+        <w:tabs>
+          <w:tab w:val="num" w:pos="2880"/>
+        </w:tabs>
+        <w:ind w:left="2880" w:hanging="360"/>
+      </w:pPr>
+      <w:rPr>
+        <w:rFonts w:ascii="Wingdings" w:hAnsi="Wingdings" w:hint="default"/>
+        <w:sz w:val="20"/>
+      </w:rPr>
+    </w:lvl>
+    <w:lvl w:ilvl="4" w:tentative="1">
+      <w:start w:val="1"/>
+      <w:numFmt w:val="bullet"/>
+      <w:lvlText w:val=""/>
+      <w:lvlJc w:val="left"/>
+      <w:pPr>
+        <w:tabs>
+          <w:tab w:val="num" w:pos="3600"/>
+        </w:tabs>
+        <w:ind w:left="3600" w:hanging="360"/>
+      </w:pPr>
+      <w:rPr>
+        <w:rFonts w:ascii="Wingdings" w:hAnsi="Wingdings" w:hint="default"/>
+        <w:sz w:val="20"/>
+      </w:rPr>
+    </w:lvl>
+    <w:lvl w:ilvl="5" w:tentative="1">
+      <w:start w:val="1"/>
+      <w:numFmt w:val="bullet"/>
+      <w:lvlText w:val=""/>
+      <w:lvlJc w:val="left"/>
+      <w:pPr>
+        <w:tabs>
+          <w:tab w:val="num" w:pos="4320"/>
+        </w:tabs>
+        <w:ind w:left="4320" w:hanging="360"/>
+      </w:pPr>
+      <w:rPr>
+        <w:rFonts w:ascii="Wingdings" w:hAnsi="Wingdings" w:hint="default"/>
+        <w:sz w:val="20"/>
+      </w:rPr>
+    </w:lvl>
+    <w:lvl w:ilvl="6" w:tentative="1">
+      <w:start w:val="1"/>
+      <w:numFmt w:val="bullet"/>
+      <w:lvlText w:val=""/>
+      <w:lvlJc w:val="left"/>
+      <w:pPr>
+        <w:tabs>
+          <w:tab w:val="num" w:pos="5040"/>
+        </w:tabs>
+        <w:ind w:left="5040" w:hanging="360"/>
+      </w:pPr>
+      <w:rPr>
+        <w:rFonts w:ascii="Wingdings" w:hAnsi="Wingdings" w:hint="default"/>
+        <w:sz w:val="20"/>
+      </w:rPr>
+    </w:lvl>
+    <w:lvl w:ilvl="7" w:tentative="1">
+      <w:start w:val="1"/>
+      <w:numFmt w:val="bullet"/>
+      <w:lvlText w:val=""/>
+      <w:lvlJc w:val="left"/>
+      <w:pPr>
+        <w:tabs>
+          <w:tab w:val="num" w:pos="5760"/>
+        </w:tabs>
+        <w:ind w:left="5760" w:hanging="360"/>
+      </w:pPr>
+      <w:rPr>
+        <w:rFonts w:ascii="Wingdings" w:hAnsi="Wingdings" w:hint="default"/>
+        <w:sz w:val="20"/>
+      </w:rPr>
+    </w:lvl>
+    <w:lvl w:ilvl="8" w:tentative="1">
+      <w:start w:val="1"/>
+      <w:numFmt w:val="bullet"/>
+      <w:lvlText w:val=""/>
+      <w:lvlJc w:val="left"/>
+      <w:pPr>
+        <w:tabs>
+          <w:tab w:val="num" w:pos="6480"/>
+        </w:tabs>
+        <w:ind w:left="6480" w:hanging="360"/>
+      </w:pPr>
+      <w:rPr>
+        <w:rFonts w:ascii="Wingdings" w:hAnsi="Wingdings" w:hint="default"/>
+        <w:sz w:val="20"/>
+      </w:rPr>
+    </w:lvl>
+  </w:abstractNum>
+  <w:abstractNum w:abstractNumId="1" w15:restartNumberingAfterBreak="0">
+    <w:nsid w:val="25A4466D"/>
+    <w:multiLevelType w:val="multilevel"/>
+    <w:tmpl w:val="208857BA"/>
+    <w:lvl w:ilvl="0">
+      <w:start w:val="1"/>
+      <w:numFmt w:val="bullet"/>
+      <w:lvlText w:val=""/>
+      <w:lvlJc w:val="left"/>
+      <w:pPr>
+        <w:tabs>
+          <w:tab w:val="num" w:pos="720"/>
+        </w:tabs>
+        <w:ind w:left="720" w:hanging="360"/>
+      </w:pPr>
+      <w:rPr>
+        <w:rFonts w:ascii="Symbol" w:hAnsi="Symbol" w:hint="default"/>
+        <w:sz w:val="20"/>
+      </w:rPr>
+    </w:lvl>
+    <w:lvl w:ilvl="1" w:tentative="1">
+      <w:start w:val="1"/>
+      <w:numFmt w:val="bullet"/>
+      <w:lvlText w:val="o"/>
+      <w:lvlJc w:val="left"/>
+      <w:pPr>
+        <w:tabs>
+          <w:tab w:val="num" w:pos="1440"/>
+        </w:tabs>
+        <w:ind w:left="1440" w:hanging="360"/>
+      </w:pPr>
+      <w:rPr>
+        <w:rFonts w:ascii="Courier New" w:hAnsi="Courier New" w:hint="default"/>
+        <w:sz w:val="20"/>
+      </w:rPr>
+    </w:lvl>
+    <w:lvl w:ilvl="2" w:tentative="1">
+      <w:start w:val="1"/>
+      <w:numFmt w:val="bullet"/>
+      <w:lvlText w:val=""/>
+      <w:lvlJc w:val="left"/>
+      <w:pPr>
+        <w:tabs>
+          <w:tab w:val="num" w:pos="2160"/>
+        </w:tabs>
+        <w:ind w:left="2160" w:hanging="360"/>
+      </w:pPr>
+      <w:rPr>
+        <w:rFonts w:ascii="Wingdings" w:hAnsi="Wingdings" w:hint="default"/>
+        <w:sz w:val="20"/>
+      </w:rPr>
+    </w:lvl>
+    <w:lvl w:ilvl="3" w:tentative="1">
+      <w:start w:val="1"/>
+      <w:numFmt w:val="bullet"/>
+      <w:lvlText w:val=""/>
+      <w:lvlJc w:val="left"/>
+      <w:pPr>
+        <w:tabs>
+          <w:tab w:val="num" w:pos="2880"/>
+        </w:tabs>
+        <w:ind w:left="2880" w:hanging="360"/>
+      </w:pPr>
+      <w:rPr>
+        <w:rFonts w:ascii="Wingdings" w:hAnsi="Wingdings" w:hint="default"/>
+        <w:sz w:val="20"/>
+      </w:rPr>
+    </w:lvl>
+    <w:lvl w:ilvl="4" w:tentative="1">
+      <w:start w:val="1"/>
+      <w:numFmt w:val="bullet"/>
+      <w:lvlText w:val=""/>
+      <w:lvlJc w:val="left"/>
+      <w:pPr>
+        <w:tabs>
+          <w:tab w:val="num" w:pos="3600"/>
+        </w:tabs>
+        <w:ind w:left="3600" w:hanging="360"/>
+      </w:pPr>
+      <w:rPr>
+        <w:rFonts w:ascii="Wingdings" w:hAnsi="Wingdings" w:hint="default"/>
+        <w:sz w:val="20"/>
+      </w:rPr>
+    </w:lvl>
+    <w:lvl w:ilvl="5" w:tentative="1">
+      <w:start w:val="1"/>
+      <w:numFmt w:val="bullet"/>
+      <w:lvlText w:val=""/>
+      <w:lvlJc w:val="left"/>
+      <w:pPr>
+        <w:tabs>
+          <w:tab w:val="num" w:pos="4320"/>
+        </w:tabs>
+        <w:ind w:left="4320" w:hanging="360"/>
+      </w:pPr>
+      <w:rPr>
+        <w:rFonts w:ascii="Wingdings" w:hAnsi="Wingdings" w:hint="default"/>
+        <w:sz w:val="20"/>
+      </w:rPr>
+    </w:lvl>
+    <w:lvl w:ilvl="6" w:tentative="1">
+      <w:start w:val="1"/>
+      <w:numFmt w:val="bullet"/>
+      <w:lvlText w:val=""/>
+      <w:lvlJc w:val="left"/>
+      <w:pPr>
+        <w:tabs>
+          <w:tab w:val="num" w:pos="5040"/>
+        </w:tabs>
+        <w:ind w:left="5040" w:hanging="360"/>
+      </w:pPr>
+      <w:rPr>
+        <w:rFonts w:ascii="Wingdings" w:hAnsi="Wingdings" w:hint="default"/>
+        <w:sz w:val="20"/>
+      </w:rPr>
+    </w:lvl>
+    <w:lvl w:ilvl="7" w:tentative="1">
+      <w:start w:val="1"/>
+      <w:numFmt w:val="bullet"/>
+      <w:lvlText w:val=""/>
+      <w:lvlJc w:val="left"/>
+      <w:pPr>
+        <w:tabs>
+          <w:tab w:val="num" w:pos="5760"/>
+        </w:tabs>
+        <w:ind w:left="5760" w:hanging="360"/>
+      </w:pPr>
+      <w:rPr>
+        <w:rFonts w:ascii="Wingdings" w:hAnsi="Wingdings" w:hint="default"/>
+        <w:sz w:val="20"/>
+      </w:rPr>
+    </w:lvl>
+    <w:lvl w:ilvl="8" w:tentative="1">
+      <w:start w:val="1"/>
+      <w:numFmt w:val="bullet"/>
+      <w:lvlText w:val=""/>
+      <w:lvlJc w:val="left"/>
+      <w:pPr>
+        <w:tabs>
+          <w:tab w:val="num" w:pos="6480"/>
+        </w:tabs>
+        <w:ind w:left="6480" w:hanging="360"/>
+      </w:pPr>
+      <w:rPr>
+        <w:rFonts w:ascii="Wingdings" w:hAnsi="Wingdings" w:hint="default"/>
+        <w:sz w:val="20"/>
+      </w:rPr>
+    </w:lvl>
+  </w:abstractNum>
+  <w:abstractNum w:abstractNumId="2" w15:restartNumberingAfterBreak="0">
+    <w:nsid w:val="67795B10"/>
+    <w:multiLevelType w:val="multilevel"/>
+    <w:tmpl w:val="88CC85C8"/>
+    <w:lvl w:ilvl="0">
+      <w:start w:val="1"/>
+      <w:numFmt w:val="bullet"/>
+      <w:lvlText w:val=""/>
+      <w:lvlJc w:val="left"/>
+      <w:pPr>
+        <w:tabs>
+          <w:tab w:val="num" w:pos="720"/>
+        </w:tabs>
+        <w:ind w:left="720" w:hanging="360"/>
+      </w:pPr>
+      <w:rPr>
+        <w:rFonts w:ascii="Symbol" w:hAnsi="Symbol" w:hint="default"/>
+        <w:sz w:val="20"/>
+      </w:rPr>
+    </w:lvl>
+    <w:lvl w:ilvl="1" w:tentative="1">
+      <w:start w:val="1"/>
+      <w:numFmt w:val="bullet"/>
+      <w:lvlText w:val="o"/>
+      <w:lvlJc w:val="left"/>
+      <w:pPr>
+        <w:tabs>
+          <w:tab w:val="num" w:pos="1440"/>
+        </w:tabs>
+        <w:ind w:left="1440" w:hanging="360"/>
+      </w:pPr>
+      <w:rPr>
+        <w:rFonts w:ascii="Courier New" w:hAnsi="Courier New" w:hint="default"/>
+        <w:sz w:val="20"/>
+      </w:rPr>
+    </w:lvl>
+    <w:lvl w:ilvl="2" w:tentative="1">
+      <w:start w:val="1"/>
+      <w:numFmt w:val="bullet"/>
+      <w:lvlText w:val=""/>
+      <w:lvlJc w:val="left"/>
+      <w:pPr>
+        <w:tabs>
+          <w:tab w:val="num" w:pos="2160"/>
+        </w:tabs>
+        <w:ind w:left="2160" w:hanging="360"/>
+      </w:pPr>
+      <w:rPr>
+        <w:rFonts w:ascii="Wingdings" w:hAnsi="Wingdings" w:hint="default"/>
+        <w:sz w:val="20"/>
+      </w:rPr>
+    </w:lvl>
+    <w:lvl w:ilvl="3" w:tentative="1">
+      <w:start w:val="1"/>
+      <w:numFmt w:val="bullet"/>
+      <w:lvlText w:val=""/>
+      <w:lvlJc w:val="left"/>
+      <w:pPr>
+        <w:tabs>
+          <w:tab w:val="num" w:pos="2880"/>
+        </w:tabs>
+        <w:ind w:left="2880" w:hanging="360"/>
+      </w:pPr>
+      <w:rPr>
+        <w:rFonts w:ascii="Wingdings" w:hAnsi="Wingdings" w:hint="default"/>
+        <w:sz w:val="20"/>
+      </w:rPr>
+    </w:lvl>
+    <w:lvl w:ilvl="4" w:tentative="1">
+      <w:start w:val="1"/>
+      <w:numFmt w:val="bullet"/>
+      <w:lvlText w:val=""/>
+      <w:lvlJc w:val="left"/>
+      <w:pPr>
+        <w:tabs>
+          <w:tab w:val="num" w:pos="3600"/>
+        </w:tabs>
+        <w:ind w:left="3600" w:hanging="360"/>
+      </w:pPr>
+      <w:rPr>
+        <w:rFonts w:ascii="Wingdings" w:hAnsi="Wingdings" w:hint="default"/>
+        <w:sz w:val="20"/>
+      </w:rPr>
+    </w:lvl>
+    <w:lvl w:ilvl="5" w:tentative="1">
+      <w:start w:val="1"/>
+      <w:numFmt w:val="bullet"/>
+      <w:lvlText w:val=""/>
+      <w:lvlJc w:val="left"/>
+      <w:pPr>
+        <w:tabs>
+          <w:tab w:val="num" w:pos="4320"/>
+        </w:tabs>
+        <w:ind w:left="4320" w:hanging="360"/>
+      </w:pPr>
+      <w:rPr>
+        <w:rFonts w:ascii="Wingdings" w:hAnsi="Wingdings" w:hint="default"/>
+        <w:sz w:val="20"/>
+      </w:rPr>
+    </w:lvl>
+    <w:lvl w:ilvl="6" w:tentative="1">
+      <w:start w:val="1"/>
+      <w:numFmt w:val="bullet"/>
+      <w:lvlText w:val=""/>
+      <w:lvlJc w:val="left"/>
+      <w:pPr>
+        <w:tabs>
+          <w:tab w:val="num" w:pos="5040"/>
+        </w:tabs>
+        <w:ind w:left="5040" w:hanging="360"/>
+      </w:pPr>
+      <w:rPr>
+        <w:rFonts w:ascii="Wingdings" w:hAnsi="Wingdings" w:hint="default"/>
+        <w:sz w:val="20"/>
+      </w:rPr>
+    </w:lvl>
+    <w:lvl w:ilvl="7" w:tentative="1">
+      <w:start w:val="1"/>
+      <w:numFmt w:val="bullet"/>
+      <w:lvlText w:val=""/>
+      <w:lvlJc w:val="left"/>
+      <w:pPr>
+        <w:tabs>
+          <w:tab w:val="num" w:pos="5760"/>
+        </w:tabs>
+        <w:ind w:left="5760" w:hanging="360"/>
+      </w:pPr>
+      <w:rPr>
+        <w:rFonts w:ascii="Wingdings" w:hAnsi="Wingdings" w:hint="default"/>
+        <w:sz w:val="20"/>
+      </w:rPr>
+    </w:lvl>
+    <w:lvl w:ilvl="8" w:tentative="1">
+      <w:start w:val="1"/>
+      <w:numFmt w:val="bullet"/>
+      <w:lvlText w:val=""/>
+      <w:lvlJc w:val="left"/>
+      <w:pPr>
+        <w:tabs>
+          <w:tab w:val="num" w:pos="6480"/>
+        </w:tabs>
+        <w:ind w:left="6480" w:hanging="360"/>
+      </w:pPr>
+      <w:rPr>
+        <w:rFonts w:ascii="Wingdings" w:hAnsi="Wingdings" w:hint="default"/>
+        <w:sz w:val="20"/>
+      </w:rPr>
+    </w:lvl>
+  </w:abstractNum>
+  <w:abstractNum w:abstractNumId="3" w15:restartNumberingAfterBreak="0">
+    <w:nsid w:val="71E40032"/>
+    <w:multiLevelType w:val="multilevel"/>
+    <w:tmpl w:val="591291D4"/>
+    <w:lvl w:ilvl="0">
+      <w:start w:val="1"/>
+      <w:numFmt w:val="bullet"/>
+      <w:lvlText w:val=""/>
+      <w:lvlJc w:val="left"/>
+      <w:pPr>
+        <w:tabs>
+          <w:tab w:val="num" w:pos="720"/>
+        </w:tabs>
+        <w:ind w:left="720" w:hanging="360"/>
+      </w:pPr>
+      <w:rPr>
+        <w:rFonts w:ascii="Symbol" w:hAnsi="Symbol" w:hint="default"/>
+        <w:sz w:val="20"/>
+      </w:rPr>
+    </w:lvl>
+    <w:lvl w:ilvl="1" w:tentative="1">
+      <w:start w:val="1"/>
+      <w:numFmt w:val="bullet"/>
+      <w:lvlText w:val="o"/>
+      <w:lvlJc w:val="left"/>
+      <w:pPr>
+        <w:tabs>
+          <w:tab w:val="num" w:pos="1440"/>
+        </w:tabs>
+        <w:ind w:left="1440" w:hanging="360"/>
+      </w:pPr>
+      <w:rPr>
+        <w:rFonts w:ascii="Courier New" w:hAnsi="Courier New" w:hint="default"/>
+        <w:sz w:val="20"/>
+      </w:rPr>
+    </w:lvl>
+    <w:lvl w:ilvl="2" w:tentative="1">
+      <w:start w:val="1"/>
+      <w:numFmt w:val="bullet"/>
+      <w:lvlText w:val=""/>
+      <w:lvlJc w:val="left"/>
+      <w:pPr>
+        <w:tabs>
+          <w:tab w:val="num" w:pos="2160"/>
+        </w:tabs>
+        <w:ind w:left="2160" w:hanging="360"/>
+      </w:pPr>
+      <w:rPr>
+        <w:rFonts w:ascii="Wingdings" w:hAnsi="Wingdings" w:hint="default"/>
+        <w:sz w:val="20"/>
+      </w:rPr>
+    </w:lvl>
+    <w:lvl w:ilvl="3" w:tentative="1">
+      <w:start w:val="1"/>
+      <w:numFmt w:val="bullet"/>
+      <w:lvlText w:val=""/>
+      <w:lvlJc w:val="left"/>
+      <w:pPr>
+        <w:tabs>
+          <w:tab w:val="num" w:pos="2880"/>
+        </w:tabs>
+        <w:ind w:left="2880" w:hanging="360"/>
+      </w:pPr>
+      <w:rPr>
+        <w:rFonts w:ascii="Wingdings" w:hAnsi="Wingdings" w:hint="default"/>
+        <w:sz w:val="20"/>
+      </w:rPr>
+    </w:lvl>
+    <w:lvl w:ilvl="4" w:tentative="1">
+      <w:start w:val="1"/>
+      <w:numFmt w:val="bullet"/>
+      <w:lvlText w:val=""/>
+      <w:lvlJc w:val="left"/>
+      <w:pPr>
+        <w:tabs>
+          <w:tab w:val="num" w:pos="3600"/>
+        </w:tabs>
+        <w:ind w:left="3600" w:hanging="360"/>
+      </w:pPr>
+      <w:rPr>
+        <w:rFonts w:ascii="Wingdings" w:hAnsi="Wingdings" w:hint="default"/>
+        <w:sz w:val="20"/>
+      </w:rPr>
+    </w:lvl>
+    <w:lvl w:ilvl="5" w:tentative="1">
+      <w:start w:val="1"/>
+      <w:numFmt w:val="bullet"/>
+      <w:lvlText w:val=""/>
+      <w:lvlJc w:val="left"/>
+      <w:pPr>
+        <w:tabs>
+          <w:tab w:val="num" w:pos="4320"/>
+        </w:tabs>
+        <w:ind w:left="4320" w:hanging="360"/>
+      </w:pPr>
+      <w:rPr>
+        <w:rFonts w:ascii="Wingdings" w:hAnsi="Wingdings" w:hint="default"/>
+        <w:sz w:val="20"/>
+      </w:rPr>
+    </w:lvl>
+    <w:lvl w:ilvl="6" w:tentative="1">
+      <w:start w:val="1"/>
+      <w:numFmt w:val="bullet"/>
+      <w:lvlText w:val=""/>
+      <w:lvlJc w:val="left"/>
+      <w:pPr>
+        <w:tabs>
+          <w:tab w:val="num" w:pos="5040"/>
+        </w:tabs>
+        <w:ind w:left="5040" w:hanging="360"/>
+      </w:pPr>
+      <w:rPr>
+        <w:rFonts w:ascii="Wingdings" w:hAnsi="Wingdings" w:hint="default"/>
+        <w:sz w:val="20"/>
+      </w:rPr>
+    </w:lvl>
+    <w:lvl w:ilvl="7" w:tentative="1">
+      <w:start w:val="1"/>
+      <w:numFmt w:val="bullet"/>
+      <w:lvlText w:val=""/>
+      <w:lvlJc w:val="left"/>
+      <w:pPr>
+        <w:tabs>
+          <w:tab w:val="num" w:pos="5760"/>
+        </w:tabs>
+        <w:ind w:left="5760" w:hanging="360"/>
+      </w:pPr>
+      <w:rPr>
+        <w:rFonts w:ascii="Wingdings" w:hAnsi="Wingdings" w:hint="default"/>
+        <w:sz w:val="20"/>
+      </w:rPr>
+    </w:lvl>
+    <w:lvl w:ilvl="8" w:tentative="1">
+      <w:start w:val="1"/>
+      <w:numFmt w:val="bullet"/>
+      <w:lvlText w:val=""/>
+      <w:lvlJc w:val="left"/>
+      <w:pPr>
+        <w:tabs>
+          <w:tab w:val="num" w:pos="6480"/>
+        </w:tabs>
+        <w:ind w:left="6480" w:hanging="360"/>
+      </w:pPr>
+      <w:rPr>
+        <w:rFonts w:ascii="Wingdings" w:hAnsi="Wingdings" w:hint="default"/>
+        <w:sz w:val="20"/>
+      </w:rPr>
+    </w:lvl>
+  </w:abstractNum>
+  <w:abstractNum w:abstractNumId="4" w15:restartNumberingAfterBreak="0">
+    <w:nsid w:val="78AF156C"/>
+    <w:multiLevelType w:val="hybridMultilevel"/>
+    <w:tmpl w:val="368A9FDE"/>
+    <w:lvl w:ilvl="0" w:tplc="BAFABE2C">
+      <w:numFmt w:val="bullet"/>
+      <w:lvlText w:val="-"/>
+      <w:lvlJc w:val="left"/>
+      <w:pPr>
+        <w:ind w:left="720" w:hanging="360"/>
+      </w:pPr>
+      <w:rPr>
+        <w:rFonts w:ascii="Times New Roman" w:eastAsiaTheme="minorHAnsi" w:hAnsi="Times New Roman" w:cs="Times New Roman" w:hint="default"/>
+      </w:rPr>
+    </w:lvl>
+    <w:lvl w:ilvl="1" w:tplc="04090003" w:tentative="1">
+      <w:start w:val="1"/>
+      <w:numFmt w:val="bullet"/>
+      <w:lvlText w:val="o"/>
+      <w:lvlJc w:val="left"/>
+      <w:pPr>
+        <w:ind w:left="1440" w:hanging="360"/>
+      </w:pPr>
+      <w:rPr>
+        <w:rFonts w:ascii="Courier New" w:hAnsi="Courier New" w:cs="Courier New" w:hint="default"/>
+      </w:rPr>
+    </w:lvl>
+    <w:lvl w:ilvl="2" w:tplc="04090005" w:tentative="1">
+      <w:start w:val="1"/>
+      <w:numFmt w:val="bullet"/>
+      <w:lvlText w:val=""/>
+      <w:lvlJc w:val="left"/>
+      <w:pPr>
+        <w:ind w:left="2160" w:hanging="360"/>
+      </w:pPr>
+      <w:rPr>
+        <w:rFonts w:ascii="Wingdings" w:hAnsi="Wingdings" w:hint="default"/>
+      </w:rPr>
+    </w:lvl>
+    <w:lvl w:ilvl="3" w:tplc="04090001" w:tentative="1">
+      <w:start w:val="1"/>
+      <w:numFmt w:val="bullet"/>
+      <w:lvlText w:val=""/>
+      <w:lvlJc w:val="left"/>
+      <w:pPr>
+        <w:ind w:left="2880" w:hanging="360"/>
+      </w:pPr>
+      <w:rPr>
+        <w:rFonts w:ascii="Symbol" w:hAnsi="Symbol" w:hint="default"/>
+      </w:rPr>
+    </w:lvl>
+    <w:lvl w:ilvl="4" w:tplc="04090003" w:tentative="1">
+      <w:start w:val="1"/>
+      <w:numFmt w:val="bullet"/>
+      <w:lvlText w:val="o"/>
+      <w:lvlJc w:val="left"/>
+      <w:pPr>
+        <w:ind w:left="3600" w:hanging="360"/>
+      </w:pPr>
+      <w:rPr>
+        <w:rFonts w:ascii="Courier New" w:hAnsi="Courier New" w:cs="Courier New" w:hint="default"/>
+      </w:rPr>
+    </w:lvl>
+    <w:lvl w:ilvl="5" w:tplc="04090005" w:tentative="1">
+      <w:start w:val="1"/>
+      <w:numFmt w:val="bullet"/>
+      <w:lvlText w:val=""/>
+      <w:lvlJc w:val="left"/>
+      <w:pPr>
+        <w:ind w:left="4320" w:hanging="360"/>
+      </w:pPr>
+      <w:rPr>
+        <w:rFonts w:ascii="Wingdings" w:hAnsi="Wingdings" w:hint="default"/>
+      </w:rPr>
+    </w:lvl>
+    <w:lvl w:ilvl="6" w:tplc="04090001" w:tentative="1">
+      <w:start w:val="1"/>
+      <w:numFmt w:val="bullet"/>
+      <w:lvlText w:val=""/>
+      <w:lvlJc w:val="left"/>
+      <w:pPr>
+        <w:ind w:left="5040" w:hanging="360"/>
+      </w:pPr>
+      <w:rPr>
+        <w:rFonts w:ascii="Symbol" w:hAnsi="Symbol" w:hint="default"/>
+      </w:rPr>
+    </w:lvl>
+    <w:lvl w:ilvl="7" w:tplc="04090003" w:tentative="1">
+      <w:start w:val="1"/>
+      <w:numFmt w:val="bullet"/>
+      <w:lvlText w:val="o"/>
+      <w:lvlJc w:val="left"/>
+      <w:pPr>
+        <w:ind w:left="5760" w:hanging="360"/>
+      </w:pPr>
+      <w:rPr>
+        <w:rFonts w:ascii="Courier New" w:hAnsi="Courier New" w:cs="Courier New" w:hint="default"/>
+      </w:rPr>
+    </w:lvl>
+    <w:lvl w:ilvl="8" w:tplc="04090005" w:tentative="1">
+      <w:start w:val="1"/>
+      <w:numFmt w:val="bullet"/>
+      <w:lvlText w:val=""/>
+      <w:lvlJc w:val="left"/>
+      <w:pPr>
+        <w:ind w:left="6480" w:hanging="360"/>
+      </w:pPr>
+      <w:rPr>
+        <w:rFonts w:ascii="Wingdings" w:hAnsi="Wingdings" w:hint="default"/>
+      </w:rPr>
+    </w:lvl>
+  </w:abstractNum>
+  <w:abstractNum w:abstractNumId="5" w15:restartNumberingAfterBreak="0">
+    <w:nsid w:val="7EC3405A"/>
+    <w:multiLevelType w:val="multilevel"/>
+    <w:tmpl w:val="D994B6D0"/>
+    <w:lvl w:ilvl="0">
+      <w:start w:val="1"/>
+      <w:numFmt w:val="bullet"/>
+      <w:lvlText w:val=""/>
+      <w:lvlJc w:val="left"/>
+      <w:pPr>
+        <w:tabs>
+          <w:tab w:val="num" w:pos="720"/>
+        </w:tabs>
+        <w:ind w:left="720" w:hanging="360"/>
+      </w:pPr>
+      <w:rPr>
+        <w:rFonts w:ascii="Symbol" w:hAnsi="Symbol" w:hint="default"/>
+        <w:sz w:val="20"/>
+      </w:rPr>
+    </w:lvl>
+    <w:lvl w:ilvl="1" w:tentative="1">
+      <w:start w:val="1"/>
+      <w:numFmt w:val="bullet"/>
+      <w:lvlText w:val="o"/>
+      <w:lvlJc w:val="left"/>
+      <w:pPr>
+        <w:tabs>
+          <w:tab w:val="num" w:pos="1440"/>
+        </w:tabs>
+        <w:ind w:left="1440" w:hanging="360"/>
+      </w:pPr>
+      <w:rPr>
+        <w:rFonts w:ascii="Courier New" w:hAnsi="Courier New" w:hint="default"/>
+        <w:sz w:val="20"/>
+      </w:rPr>
+    </w:lvl>
+    <w:lvl w:ilvl="2" w:tentative="1">
+      <w:start w:val="1"/>
+      <w:numFmt w:val="bullet"/>
+      <w:lvlText w:val=""/>
+      <w:lvlJc w:val="left"/>
+      <w:pPr>
+        <w:tabs>
+          <w:tab w:val="num" w:pos="2160"/>
+        </w:tabs>
+        <w:ind w:left="2160" w:hanging="360"/>
+      </w:pPr>
+      <w:rPr>
+        <w:rFonts w:ascii="Wingdings" w:hAnsi="Wingdings" w:hint="default"/>
+        <w:sz w:val="20"/>
+      </w:rPr>
+    </w:lvl>
+    <w:lvl w:ilvl="3" w:tentative="1">
+      <w:start w:val="1"/>
+      <w:numFmt w:val="bullet"/>
+      <w:lvlText w:val=""/>
+      <w:lvlJc w:val="left"/>
+      <w:pPr>
+        <w:tabs>
+          <w:tab w:val="num" w:pos="2880"/>
+        </w:tabs>
+        <w:ind w:left="2880" w:hanging="360"/>
+      </w:pPr>
+      <w:rPr>
+        <w:rFonts w:ascii="Wingdings" w:hAnsi="Wingdings" w:hint="default"/>
+        <w:sz w:val="20"/>
+      </w:rPr>
+    </w:lvl>
+    <w:lvl w:ilvl="4" w:tentative="1">
+      <w:start w:val="1"/>
+      <w:numFmt w:val="bullet"/>
+      <w:lvlText w:val=""/>
+      <w:lvlJc w:val="left"/>
+      <w:pPr>
+        <w:tabs>
+          <w:tab w:val="num" w:pos="3600"/>
+        </w:tabs>
+        <w:ind w:left="3600" w:hanging="360"/>
+      </w:pPr>
+      <w:rPr>
+        <w:rFonts w:ascii="Wingdings" w:hAnsi="Wingdings" w:hint="default"/>
+        <w:sz w:val="20"/>
+      </w:rPr>
+    </w:lvl>
+    <w:lvl w:ilvl="5" w:tentative="1">
+      <w:start w:val="1"/>
+      <w:numFmt w:val="bullet"/>
+      <w:lvlText w:val=""/>
+      <w:lvlJc w:val="left"/>
+      <w:pPr>
+        <w:tabs>
+          <w:tab w:val="num" w:pos="4320"/>
+        </w:tabs>
+        <w:ind w:left="4320" w:hanging="360"/>
+      </w:pPr>
+      <w:rPr>
+        <w:rFonts w:ascii="Wingdings" w:hAnsi="Wingdings" w:hint="default"/>
+        <w:sz w:val="20"/>
+      </w:rPr>
+    </w:lvl>
+    <w:lvl w:ilvl="6" w:tentative="1">
+      <w:start w:val="1"/>
+      <w:numFmt w:val="bullet"/>
+      <w:lvlText w:val=""/>
+      <w:lvlJc w:val="left"/>
+      <w:pPr>
+        <w:tabs>
+          <w:tab w:val="num" w:pos="5040"/>
+        </w:tabs>
+        <w:ind w:left="5040" w:hanging="360"/>
+      </w:pPr>
+      <w:rPr>
+        <w:rFonts w:ascii="Wingdings" w:hAnsi="Wingdings" w:hint="default"/>
+        <w:sz w:val="20"/>
+      </w:rPr>
+    </w:lvl>
+    <w:lvl w:ilvl="7" w:tentative="1">
+      <w:start w:val="1"/>
+      <w:numFmt w:val="bullet"/>
+      <w:lvlText w:val=""/>
+      <w:lvlJc w:val="left"/>
+      <w:pPr>
+        <w:tabs>
+          <w:tab w:val="num" w:pos="5760"/>
+        </w:tabs>
+        <w:ind w:left="5760" w:hanging="360"/>
+      </w:pPr>
+      <w:rPr>
+        <w:rFonts w:ascii="Wingdings" w:hAnsi="Wingdings" w:hint="default"/>
+        <w:sz w:val="20"/>
+      </w:rPr>
+    </w:lvl>
+    <w:lvl w:ilvl="8" w:tentative="1">
+      <w:start w:val="1"/>
+      <w:numFmt w:val="bullet"/>
+      <w:lvlText w:val=""/>
+      <w:lvlJc w:val="left"/>
+      <w:pPr>
+        <w:tabs>
+          <w:tab w:val="num" w:pos="6480"/>
+        </w:tabs>
+        <w:ind w:left="6480" w:hanging="360"/>
+      </w:pPr>
+      <w:rPr>
+        <w:rFonts w:ascii="Wingdings" w:hAnsi="Wingdings" w:hint="default"/>
+        <w:sz w:val="20"/>
+      </w:rPr>
+    </w:lvl>
+  </w:abstractNum>
+  <w:num w:numId="1" w16cid:durableId="1232234118">
+    <w:abstractNumId w:val="4"/>
+  </w:num>
+  <w:num w:numId="2" w16cid:durableId="1613317841">
+    <w:abstractNumId w:val="5"/>
+  </w:num>
+  <w:num w:numId="3" w16cid:durableId="1828669870">
+    <w:abstractNumId w:val="0"/>
+  </w:num>
+  <w:num w:numId="4" w16cid:durableId="7409909">
+    <w:abstractNumId w:val="1"/>
+  </w:num>
+  <w:num w:numId="5" w16cid:durableId="193428073">
+    <w:abstractNumId w:val="3"/>
+  </w:num>
+  <w:num w:numId="6" w16cid:durableId="1410734865">
+    <w:abstractNumId w:val="2"/>
+  </w:num>
+</w:numbering>
 </file>
 
 <file path=word/people.xml><?xml version="1.0" encoding="utf-8"?>
@@ -4631,7 +6716,7 @@
   <w:style w:type="paragraph" w:default="1" w:styleId="Normal">
     <w:name w:val="Normal"/>
     <w:qFormat/>
-    <w:rsid w:val="00E17DB9"/>
+    <w:rsid w:val="00D069FF"/>
     <w:pPr>
       <w:spacing w:after="200" w:line="276" w:lineRule="auto"/>
     </w:pPr>
@@ -5328,6 +7413,29 @@
       <w14:ligatures w14:val="none"/>
     </w:rPr>
   </w:style>
+  <w:style w:type="character" w:styleId="Hyperlink">
+    <w:name w:val="Hyperlink"/>
+    <w:basedOn w:val="DefaultParagraphFont"/>
+    <w:uiPriority w:val="99"/>
+    <w:unhideWhenUsed/>
+    <w:rsid w:val="001429FD"/>
+    <w:rPr>
+      <w:color w:val="467886" w:themeColor="hyperlink"/>
+      <w:u w:val="single"/>
+    </w:rPr>
+  </w:style>
+  <w:style w:type="character" w:styleId="UnresolvedMention">
+    <w:name w:val="Unresolved Mention"/>
+    <w:basedOn w:val="DefaultParagraphFont"/>
+    <w:uiPriority w:val="99"/>
+    <w:semiHidden/>
+    <w:unhideWhenUsed/>
+    <w:rsid w:val="001429FD"/>
+    <w:rPr>
+      <w:color w:val="605E5C"/>
+      <w:shd w:val="clear" w:color="auto" w:fill="E1DFDD"/>
+    </w:rPr>
+  </w:style>
 </w:styles>
 </file>
 

</xml_diff>

<commit_message>
Team met to discuss new funds and sources.
Identifies funds to include or exclude.

Adds revenue category to new revenue sources.
</commit_message>
<xml_diff>
--- a/data/FY2025 Files/FY25 New Data Items.docx
+++ b/data/FY2025 Files/FY25 New Data Items.docx
@@ -14,29 +14,8 @@
       </w:r>
     </w:p>
     <w:p>
-      <w:proofErr w:type="spellStart"/>
-      <w:r>
-        <w:t>Code_cleaning.qmd</w:t>
-      </w:r>
-      <w:proofErr w:type="spellEnd"/>
-      <w:r>
-        <w:t xml:space="preserve"> file was </w:t>
-      </w:r>
-      <w:proofErr w:type="gramStart"/>
-      <w:r>
-        <w:t>ran</w:t>
-      </w:r>
-      <w:proofErr w:type="gramEnd"/>
-      <w:r>
-        <w:t xml:space="preserve"> to identify any changes in funds, sources, agencies, organizations, etc. from past years. </w:t>
-      </w:r>
-      <w:proofErr w:type="gramStart"/>
-      <w:r>
-        <w:t>Screenshot</w:t>
-      </w:r>
-      <w:proofErr w:type="gramEnd"/>
-      <w:r>
-        <w:t xml:space="preserve"> below is one example of differences found for the revenue sources and source names. </w:t>
+      <w:r>
+        <w:t xml:space="preserve">Code_cleaning.qmd file was ran to identify any changes in funds, sources, agencies, organizations, etc. from past years. Screenshot below is one example of differences found for the revenue sources and source names. </w:t>
       </w:r>
     </w:p>
     <w:p>
@@ -94,31 +73,7 @@
         <w:spacing w:after="0"/>
       </w:pPr>
       <w:r>
-        <w:t xml:space="preserve">Go to </w:t>
-      </w:r>
-      <w:proofErr w:type="gramStart"/>
-      <w:r>
-        <w:t>comptrollers</w:t>
-      </w:r>
-      <w:proofErr w:type="gramEnd"/>
-      <w:r>
-        <w:t xml:space="preserve"> website (ilinoiscomptroller.gov &gt; Financial Reports &amp; Data&gt; and then Expenditures or Revenues depending on what you are doing) and </w:t>
-      </w:r>
-      <w:proofErr w:type="gramStart"/>
-      <w:r>
-        <w:t>search</w:t>
-      </w:r>
-      <w:proofErr w:type="gramEnd"/>
-      <w:r>
-        <w:t xml:space="preserve"> each revenue source to see the category assigned by the comptroller. Add that variable to </w:t>
-      </w:r>
-      <w:proofErr w:type="spellStart"/>
-      <w:r>
-        <w:t>rev_type_name_COMPTROLLER</w:t>
-      </w:r>
-      <w:proofErr w:type="spellEnd"/>
-      <w:r>
-        <w:t xml:space="preserve"> in ioc_sources.xlsx. </w:t>
+        <w:t xml:space="preserve">Go to comptrollers website (ilinoiscomptroller.gov &gt; Financial Reports &amp; Data&gt; and then Expenditures or Revenues depending on what you are doing) and search each revenue source to see the category assigned by the comptroller. Add that variable to rev_type_name_COMPTROLLER in ioc_sources.xlsx. </w:t>
       </w:r>
     </w:p>
     <w:p>
@@ -131,31 +86,7 @@
         <w:spacing w:after="0"/>
       </w:pPr>
       <w:r>
-        <w:t xml:space="preserve">For each rev source identified by </w:t>
-      </w:r>
-      <w:proofErr w:type="spellStart"/>
-      <w:r>
-        <w:t>code_cleaning.qmd</w:t>
-      </w:r>
-      <w:proofErr w:type="spellEnd"/>
-      <w:r>
-        <w:t xml:space="preserve">, I </w:t>
-      </w:r>
-      <w:proofErr w:type="gramStart"/>
-      <w:r>
-        <w:t>searched</w:t>
-      </w:r>
-      <w:proofErr w:type="gramEnd"/>
-      <w:r>
-        <w:t xml:space="preserve"> the source number on the </w:t>
-      </w:r>
-      <w:proofErr w:type="gramStart"/>
-      <w:r>
-        <w:t>comptrollers</w:t>
-      </w:r>
-      <w:proofErr w:type="gramEnd"/>
-      <w:r>
-        <w:t xml:space="preserve"> website to see what the name and type of source it was. Also used best judgement for names were just slightly different to determine if they were not new revenue sources.</w:t>
+        <w:t>For each rev source identified by code_cleaning.qmd, I searched the source number on the comptrollers website to see what the name and type of source it was. Also used best judgement for names were just slightly different to determine if they were not new revenue sources.</w:t>
       </w:r>
     </w:p>
     <w:p>
@@ -254,7 +185,6 @@
                 <w:szCs w:val="20"/>
               </w:rPr>
             </w:pPr>
-            <w:proofErr w:type="spellStart"/>
             <w:r>
               <w:rPr>
                 <w:b/>
@@ -264,7 +194,6 @@
               </w:rPr>
               <w:t>Source_name</w:t>
             </w:r>
-            <w:proofErr w:type="spellEnd"/>
           </w:p>
         </w:tc>
         <w:tc>
@@ -347,7 +276,6 @@
                 <w:highlight w:val="green"/>
               </w:rPr>
             </w:pPr>
-            <w:proofErr w:type="spellStart"/>
             <w:r>
               <w:rPr>
                 <w:b/>
@@ -358,7 +286,6 @@
               </w:rPr>
               <w:t>Rev_type_number</w:t>
             </w:r>
-            <w:proofErr w:type="spellEnd"/>
           </w:p>
         </w:tc>
         <w:tc>
@@ -377,7 +304,6 @@
                 <w:highlight w:val="green"/>
               </w:rPr>
             </w:pPr>
-            <w:proofErr w:type="spellStart"/>
             <w:r>
               <w:rPr>
                 <w:b/>
@@ -388,7 +314,6 @@
               </w:rPr>
               <w:t>Rev_type_name</w:t>
             </w:r>
-            <w:proofErr w:type="spellEnd"/>
           </w:p>
         </w:tc>
       </w:tr>
@@ -1816,7 +1741,7 @@
                 <w:sz w:val="22"/>
                 <w:szCs w:val="20"/>
               </w:rPr>
-              <w:t>39</w:t>
+              <w:t>78</w:t>
             </w:r>
           </w:p>
         </w:tc>
@@ -3142,29 +3067,11 @@
         <w:t xml:space="preserve"> </w:t>
       </w:r>
       <w:r>
-        <w:t xml:space="preserve">variables in </w:t>
-      </w:r>
-      <w:proofErr w:type="spellStart"/>
-      <w:r>
-        <w:t>ioc_sources</w:t>
-      </w:r>
-      <w:proofErr w:type="spellEnd"/>
-      <w:r>
-        <w:t xml:space="preserve"> file!! </w:t>
-      </w:r>
-      <w:proofErr w:type="spellStart"/>
-      <w:r>
-        <w:t>Rev_type_name</w:t>
-      </w:r>
-      <w:proofErr w:type="spellEnd"/>
-      <w:r>
-        <w:t xml:space="preserve">, </w:t>
-      </w:r>
-      <w:proofErr w:type="spellStart"/>
+        <w:t xml:space="preserve">variables in ioc_sources file!! Rev_type_name, </w:t>
+      </w:r>
       <w:r>
         <w:t>rev_type_name_COMPTROLLER</w:t>
       </w:r>
-      <w:proofErr w:type="spellEnd"/>
       <w:r>
         <w:t xml:space="preserve"> </w:t>
       </w:r>
@@ -3201,15 +3108,7 @@
     </w:p>
     <w:p>
       <w:r>
-        <w:t xml:space="preserve">Search </w:t>
-      </w:r>
-      <w:proofErr w:type="gramStart"/>
-      <w:r>
-        <w:t>fund</w:t>
-      </w:r>
-      <w:proofErr w:type="gramEnd"/>
-      <w:r>
-        <w:t xml:space="preserve"> and find out informatin about it. IOC has fund search options: </w:t>
+        <w:t xml:space="preserve">Search fund and find out informatin about it. IOC has fund search options: </w:t>
       </w:r>
       <w:hyperlink r:id="rId6" w:history="1">
         <w:r>
@@ -3295,11 +3194,9 @@
             <w:vAlign w:val="center"/>
           </w:tcPr>
           <w:p>
-            <w:proofErr w:type="spellStart"/>
             <w:r>
               <w:t>Fund_name</w:t>
             </w:r>
-            <w:proofErr w:type="spellEnd"/>
           </w:p>
         </w:tc>
         <w:tc>
@@ -3428,7 +3325,19 @@
               <w:jc w:val="right"/>
             </w:pPr>
             <w:r>
-              <w:t>Receipts = 98667000</w:t>
+              <w:t>Receipts = 98</w:t>
+            </w:r>
+            <w:r>
+              <w:t>,</w:t>
+            </w:r>
+            <w:r>
+              <w:t>667</w:t>
+            </w:r>
+            <w:r>
+              <w:t>,</w:t>
+            </w:r>
+            <w:r>
+              <w:t>000</w:t>
             </w:r>
           </w:p>
         </w:tc>
@@ -3436,7 +3345,19 @@
           <w:tcPr>
             <w:tcW w:w="1620" w:type="dxa"/>
           </w:tcPr>
-          <w:p/>
+          <w:p>
+            <w:r>
+              <w:t xml:space="preserve">Exclude from expenditures probably just a holding fund. </w:t>
+            </w:r>
+            <w:r>
+              <w:t xml:space="preserve"> --- look into more still</w:t>
+            </w:r>
+          </w:p>
+          <w:p>
+            <w:r>
+              <w:t>Look into on revenue side.</w:t>
+            </w:r>
+          </w:p>
         </w:tc>
       </w:tr>
       <w:tr>
@@ -3563,6 +3484,12 @@
                 <w:strike/>
               </w:rPr>
             </w:pPr>
+            <w:r>
+              <w:rPr>
+                <w:strike/>
+              </w:rPr>
+              <w:t>--</w:t>
+            </w:r>
           </w:p>
         </w:tc>
       </w:tr>
@@ -3654,7 +3581,11 @@
           <w:tcPr>
             <w:tcW w:w="1620" w:type="dxa"/>
           </w:tcPr>
-          <w:p/>
+          <w:p>
+            <w:r>
+              <w:t>Included</w:t>
+            </w:r>
+          </w:p>
         </w:tc>
       </w:tr>
       <w:tr>
@@ -3745,7 +3676,11 @@
           <w:tcPr>
             <w:tcW w:w="1620" w:type="dxa"/>
           </w:tcPr>
-          <w:p/>
+          <w:p>
+            <w:r>
+              <w:t>Included</w:t>
+            </w:r>
+          </w:p>
         </w:tc>
       </w:tr>
       <w:tr>
@@ -3805,7 +3740,6 @@
             <w:hideMark/>
           </w:tcPr>
           <w:p>
-            <w:proofErr w:type="gramStart"/>
             <w:r>
               <w:t>REUSED-3</w:t>
             </w:r>
@@ -3815,7 +3749,6 @@
               </w:rPr>
               <w:t>rd</w:t>
             </w:r>
-            <w:proofErr w:type="gramEnd"/>
             <w:r>
               <w:t xml:space="preserve"> time! </w:t>
             </w:r>
@@ -3847,7 +3780,11 @@
           <w:tcPr>
             <w:tcW w:w="1620" w:type="dxa"/>
           </w:tcPr>
-          <w:p/>
+          <w:p>
+            <w:r>
+              <w:t>Included</w:t>
+            </w:r>
+          </w:p>
         </w:tc>
       </w:tr>
       <w:tr>
@@ -3974,6 +3911,12 @@
                 <w:strike/>
               </w:rPr>
             </w:pPr>
+            <w:r>
+              <w:rPr>
+                <w:strike/>
+              </w:rPr>
+              <w:t>--</w:t>
+            </w:r>
           </w:p>
         </w:tc>
       </w:tr>
@@ -4101,6 +4044,12 @@
                 <w:strike/>
               </w:rPr>
             </w:pPr>
+            <w:r>
+              <w:rPr>
+                <w:strike/>
+              </w:rPr>
+              <w:t>--</w:t>
+            </w:r>
           </w:p>
         </w:tc>
       </w:tr>
@@ -4192,6 +4141,7 @@
               <w:jc w:val="right"/>
             </w:pPr>
             <w:r>
+              <w:lastRenderedPageBreak/>
               <w:t>Receipts = 306602160</w:t>
             </w:r>
           </w:p>
@@ -4200,7 +4150,12 @@
           <w:tcPr>
             <w:tcW w:w="1620" w:type="dxa"/>
           </w:tcPr>
-          <w:p/>
+          <w:p>
+            <w:r>
+              <w:lastRenderedPageBreak/>
+              <w:t>Included</w:t>
+            </w:r>
+          </w:p>
         </w:tc>
       </w:tr>
       <w:tr>
@@ -4283,7 +4238,19 @@
               <w:jc w:val="right"/>
             </w:pPr>
             <w:r>
-              <w:t>1978937</w:t>
+              <w:t>1</w:t>
+            </w:r>
+            <w:r>
+              <w:t>,</w:t>
+            </w:r>
+            <w:r>
+              <w:t>978</w:t>
+            </w:r>
+            <w:r>
+              <w:t>,</w:t>
+            </w:r>
+            <w:r>
+              <w:t>937</w:t>
             </w:r>
           </w:p>
           <w:p>
@@ -4291,7 +4258,19 @@
               <w:jc w:val="right"/>
             </w:pPr>
             <w:r>
-              <w:t>Receipts = 10000000</w:t>
+              <w:t>Receipts = 10</w:t>
+            </w:r>
+            <w:r>
+              <w:t>,</w:t>
+            </w:r>
+            <w:r>
+              <w:t>000</w:t>
+            </w:r>
+            <w:r>
+              <w:t>,</w:t>
+            </w:r>
+            <w:r>
+              <w:t>000</w:t>
             </w:r>
           </w:p>
         </w:tc>
@@ -4299,7 +4278,11 @@
           <w:tcPr>
             <w:tcW w:w="1620" w:type="dxa"/>
           </w:tcPr>
-          <w:p/>
+          <w:p>
+            <w:r>
+              <w:t>Included</w:t>
+            </w:r>
+          </w:p>
         </w:tc>
       </w:tr>
       <w:tr>
@@ -4330,7 +4313,6 @@
               <w:rPr>
                 <w:strike/>
               </w:rPr>
-              <w:lastRenderedPageBreak/>
               <w:t>0358</w:t>
             </w:r>
           </w:p>
@@ -4427,6 +4409,12 @@
                 <w:strike/>
               </w:rPr>
             </w:pPr>
+            <w:r>
+              <w:rPr>
+                <w:strike/>
+              </w:rPr>
+              <w:t>--</w:t>
+            </w:r>
           </w:p>
         </w:tc>
       </w:tr>
@@ -4544,6 +4532,12 @@
                 <w:strike/>
               </w:rPr>
             </w:pPr>
+            <w:r>
+              <w:rPr>
+                <w:strike/>
+              </w:rPr>
+              <w:t>--</w:t>
+            </w:r>
           </w:p>
         </w:tc>
       </w:tr>
@@ -4635,7 +4629,11 @@
           <w:tcPr>
             <w:tcW w:w="1620" w:type="dxa"/>
           </w:tcPr>
-          <w:p/>
+          <w:p>
+            <w:r>
+              <w:t>?</w:t>
+            </w:r>
+          </w:p>
         </w:tc>
       </w:tr>
       <w:tr>
@@ -4726,7 +4724,11 @@
           <w:tcPr>
             <w:tcW w:w="1620" w:type="dxa"/>
           </w:tcPr>
-          <w:p/>
+          <w:p>
+            <w:r>
+              <w:t>Included</w:t>
+            </w:r>
+          </w:p>
         </w:tc>
       </w:tr>
       <w:tr>
@@ -4817,7 +4819,11 @@
           <w:tcPr>
             <w:tcW w:w="1620" w:type="dxa"/>
           </w:tcPr>
-          <w:p/>
+          <w:p>
+            <w:r>
+              <w:t>Included</w:t>
+            </w:r>
+          </w:p>
         </w:tc>
       </w:tr>
       <w:tr>
@@ -4904,7 +4910,14 @@
           <w:tcPr>
             <w:tcW w:w="1620" w:type="dxa"/>
           </w:tcPr>
-          <w:p/>
+          <w:p>
+            <w:pPr>
+              <w:jc w:val="center"/>
+            </w:pPr>
+            <w:r>
+              <w:t>Included</w:t>
+            </w:r>
+          </w:p>
         </w:tc>
       </w:tr>
       <w:tr>
@@ -5095,7 +5108,11 @@
           <w:tcPr>
             <w:tcW w:w="1620" w:type="dxa"/>
           </w:tcPr>
-          <w:p/>
+          <w:p>
+            <w:r>
+              <w:t>Excluded</w:t>
+            </w:r>
+          </w:p>
         </w:tc>
       </w:tr>
       <w:tr>
@@ -5222,6 +5239,12 @@
                 <w:strike/>
               </w:rPr>
             </w:pPr>
+            <w:r>
+              <w:rPr>
+                <w:strike/>
+              </w:rPr>
+              <w:t>--</w:t>
+            </w:r>
           </w:p>
         </w:tc>
       </w:tr>
@@ -5371,6 +5394,12 @@
                 <w:strike/>
               </w:rPr>
             </w:pPr>
+            <w:r>
+              <w:rPr>
+                <w:strike/>
+              </w:rPr>
+              <w:t>--</w:t>
+            </w:r>
           </w:p>
         </w:tc>
       </w:tr>
@@ -5378,37 +5407,13 @@
     <w:p/>
     <w:p>
       <w:r>
-        <w:t xml:space="preserve">Go look up </w:t>
-      </w:r>
-      <w:proofErr w:type="gramStart"/>
-      <w:r>
-        <w:t>fund</w:t>
-      </w:r>
-      <w:proofErr w:type="gramEnd"/>
-      <w:r>
-        <w:t xml:space="preserve"> on IOC website to find other variables that need to be filled in in the funds_ab_in.xlsx file. Fill in </w:t>
-      </w:r>
-      <w:proofErr w:type="gramStart"/>
-      <w:r>
-        <w:t>fund</w:t>
-      </w:r>
-      <w:proofErr w:type="gramEnd"/>
-      <w:r>
-        <w:t xml:space="preserve"> category</w:t>
+        <w:t>Go look up fund on IOC website to find other variables that need to be filled in in the funds_ab_in.xlsx file. Fill in fund category</w:t>
       </w:r>
       <w:r>
         <w:t xml:space="preserve"> and</w:t>
       </w:r>
       <w:r>
-        <w:t xml:space="preserve"> </w:t>
-      </w:r>
-      <w:proofErr w:type="gramStart"/>
-      <w:r>
-        <w:t>fund</w:t>
-      </w:r>
-      <w:proofErr w:type="gramEnd"/>
-      <w:r>
-        <w:t xml:space="preserve"> category name</w:t>
+        <w:t xml:space="preserve"> fund category name</w:t>
       </w:r>
       <w:r>
         <w:t>!</w:t>
@@ -5420,6 +5425,7 @@
     <w:p/>
     <w:p>
       <w:r>
+        <w:lastRenderedPageBreak/>
         <w:t>New Fund Information</w:t>
       </w:r>
     </w:p>
@@ -5443,7 +5449,6 @@
           <w:b/>
           <w:bCs/>
         </w:rPr>
-        <w:lastRenderedPageBreak/>
         <w:t>COMPTROLLER ASSIGNED FUND NUMBER: </w:t>
       </w:r>
       <w:r>
@@ -5552,15 +5557,7 @@
         </w:numPr>
       </w:pPr>
       <w:r>
-        <w:t xml:space="preserve">Not used yet. Info not on </w:t>
-      </w:r>
-      <w:proofErr w:type="gramStart"/>
-      <w:r>
-        <w:t>comptrollers</w:t>
-      </w:r>
-      <w:proofErr w:type="gramEnd"/>
-      <w:r>
-        <w:t xml:space="preserve"> website as of 7/17/2025</w:t>
+        <w:t>Not used yet. Info not on comptrollers website as of 7/17/2025</w:t>
       </w:r>
     </w:p>
     <w:p>
@@ -5576,15 +5573,7 @@
         </w:numPr>
       </w:pPr>
       <w:r>
-        <w:t xml:space="preserve">Not used yet. Info not on </w:t>
-      </w:r>
-      <w:proofErr w:type="gramStart"/>
-      <w:r>
-        <w:t>comptrollers</w:t>
-      </w:r>
-      <w:proofErr w:type="gramEnd"/>
-      <w:r>
-        <w:t xml:space="preserve"> website as of 7/17/2025</w:t>
+        <w:t>Not used yet. Info not on comptrollers website as of 7/17/2025</w:t>
       </w:r>
     </w:p>
     <w:p>
@@ -5600,15 +5589,7 @@
         </w:numPr>
       </w:pPr>
       <w:r>
-        <w:t xml:space="preserve">Not used yet. Info not on </w:t>
-      </w:r>
-      <w:proofErr w:type="gramStart"/>
-      <w:r>
-        <w:t>comptrollers</w:t>
-      </w:r>
-      <w:proofErr w:type="gramEnd"/>
-      <w:r>
-        <w:t xml:space="preserve"> website as of 7/17/2025</w:t>
+        <w:t>Not used yet. Info not on comptrollers website as of 7/17/2025</w:t>
       </w:r>
     </w:p>
     <w:p>
@@ -5624,15 +5605,7 @@
         </w:numPr>
       </w:pPr>
       <w:r>
-        <w:t xml:space="preserve">Not used yet. Info not on </w:t>
-      </w:r>
-      <w:proofErr w:type="gramStart"/>
-      <w:r>
-        <w:t>comptrollers</w:t>
-      </w:r>
-      <w:proofErr w:type="gramEnd"/>
-      <w:r>
-        <w:t xml:space="preserve"> website as of 7/17/2025</w:t>
+        <w:t>Not used yet. Info not on comptrollers website as of 7/17/2025</w:t>
       </w:r>
     </w:p>
     <w:p>
@@ -5648,19 +5621,12 @@
         </w:numPr>
       </w:pPr>
       <w:r>
-        <w:t xml:space="preserve">Not used yet. Info not on </w:t>
-      </w:r>
-      <w:proofErr w:type="gramStart"/>
-      <w:r>
-        <w:t>comptrollers</w:t>
-      </w:r>
-      <w:proofErr w:type="gramEnd"/>
-      <w:r>
-        <w:t xml:space="preserve"> website as of 7/17/2025</w:t>
+        <w:t>Not used yet. Info not on comptrollers website as of 7/17/2025</w:t>
       </w:r>
     </w:p>
     <w:p>
       <w:r>
+        <w:lastRenderedPageBreak/>
         <w:t>Health Equity and Access</w:t>
       </w:r>
       <w:r>
@@ -5675,15 +5641,7 @@
         </w:numPr>
       </w:pPr>
       <w:r>
-        <w:t xml:space="preserve">Not used yet. Info not on </w:t>
-      </w:r>
-      <w:proofErr w:type="gramStart"/>
-      <w:r>
-        <w:t>comptrollers</w:t>
-      </w:r>
-      <w:proofErr w:type="gramEnd"/>
-      <w:r>
-        <w:t xml:space="preserve"> website as of 7/17/2025</w:t>
+        <w:t>Not used yet. Info not on comptrollers website as of 7/17/2025</w:t>
       </w:r>
     </w:p>
     <w:p/>
@@ -5695,7 +5653,6 @@
           <w:b/>
           <w:bCs/>
         </w:rPr>
-        <w:lastRenderedPageBreak/>
         <w:t>Official Fund Name:</w:t>
       </w:r>
       <w:r>
@@ -5942,7 +5899,11 @@
       </w:r>
       <w:r>
         <w:br/>
-        <w:t xml:space="preserve">IS CREATED AS A SPECIAL FUND IN THE STATE TREASURY. ALL MONEYS IN THE FUND SHALL BE APPROPRIATED TO THE DEPARTMENT OF HEALTHCARE AND FAMILY SERVICES AND EXPENDED </w:t>
+        <w:t xml:space="preserve">IS CREATED AS A SPECIAL FUND IN THE STATE TREASURY. ALL MONEYS IN THE </w:t>
+      </w:r>
+      <w:r>
+        <w:lastRenderedPageBreak/>
+        <w:t xml:space="preserve">FUND SHALL BE APPROPRIATED TO THE DEPARTMENT OF HEALTHCARE AND FAMILY SERVICES AND EXPENDED </w:t>
       </w:r>
       <w:r>
         <w:rPr>
@@ -5951,15 +5912,7 @@
         <w:t>EXCLUSIVELY FOR THE MEDICAL DEBT RELIEF PILOT PROGRAM TO PROVIDE GRANT FUNDING TO A NONPROFIT MEDICAL DEBT RELIEF COORDINATOR</w:t>
       </w:r>
       <w:r>
-        <w:t xml:space="preserve"> TO BE USED TO DISCHARGE THE MDICAL DEBT OF ELIGIBLE RESIDENTS AS DEFINED IN THE MEDICAL DEBT RELIEF ACT. BASED ON A BUDGET APPROVED BY DEPARTMENT, THE GRANT </w:t>
-      </w:r>
-      <w:proofErr w:type="gramStart"/>
-      <w:r>
-        <w:t>FUNDING MAY</w:t>
-      </w:r>
-      <w:proofErr w:type="gramEnd"/>
-      <w:r>
-        <w:t xml:space="preserve"> ALSO BE USED FOR ANY ADMIN SERVICES PROVIDED BY THE NONPROFIT MEDICAL DEBT REL COORD TO DISCHRGE MED DEBT</w:t>
+        <w:t xml:space="preserve"> TO BE USED TO DISCHARGE THE MDICAL DEBT OF ELIGIBLE RESIDENTS AS DEFINED IN THE MEDICAL DEBT RELIEF ACT. BASED ON A BUDGET APPROVED BY DEPARTMENT, THE GRANT FUNDING MAY ALSO BE USED FOR ANY ADMIN SERVICES PROVIDED BY THE NONPROFIT MEDICAL DEBT REL COORD TO DISCHRGE MED DEBT</w:t>
       </w:r>
     </w:p>
     <w:p>
@@ -5968,7 +5921,6 @@
           <w:b/>
           <w:bCs/>
         </w:rPr>
-        <w:lastRenderedPageBreak/>
         <w:t>AGENCY NAMES WITH SPENDING AUTHORITY FROM FUN</w:t>
       </w:r>
       <w:r>
@@ -6222,7 +6174,6 @@
           <w:b/>
           <w:bCs/>
         </w:rPr>
-        <w:lastRenderedPageBreak/>
         <w:t>ADMINISTERING AGENCY:</w:t>
       </w:r>
       <w:r>
@@ -6415,7 +6366,11 @@
         <w:t>TRUST FUND TO BE HELD OUTSIDE THE STATE TREASURY,</w:t>
       </w:r>
       <w:r>
-        <w:t xml:space="preserve"> WITH THE STATE TREASURER AS CUSTODIAN. THE COMMISSION MAY ACCEPT MONETARY GIFTS AND GRANTS FROM ANY PUBLIC OR PRIVATE SOURCE, WHICH SHALL BE HELD IN THE FUND. ALL GIFTS, GRANTS, ASSETS, FUNDS, OR MONEY RECEIVED BY THE COMMISSION UNDER THIS ACT SHALL BE DEPOSITED AND HELD IN THE FUND BY THE STATE TREASURER AS EX OFFICIO CUSTODIAN SEPARATE AND APART FROM ALL PUBLIC MONEY OR FUNDS OF THIS STATE AND SHALL BE ADMINISTERED BY THE COMMISSION EXCLUSIVELY FOR THE PURPSES SET FORTH IN THIS ACT.</w:t>
+        <w:t xml:space="preserve"> WITH THE STATE TREASURER AS CUSTODIAN. THE COMMISSION MAY ACCEPT MONETARY GIFTS AND GRANTS FROM ANY PUBLIC OR PRIVATE SOURCE, WHICH SHALL BE HELD IN THE FUND. ALL GIFTS, GRANTS, ASSETS, FUNDS, OR MONEY RECEIVED BY THE COMMISSION UNDER THIS ACT SHALL BE DEPOSITED AND HELD IN THE FUND BY THE STATE TREASURER AS EX OFFICIO CUSTODIAN SEPARATE AND APART FROM ALL PUBLIC MONEY OR </w:t>
+      </w:r>
+      <w:r>
+        <w:lastRenderedPageBreak/>
+        <w:t>FUNDS OF THIS STATE AND SHALL BE ADMINISTERED BY THE COMMISSION EXCLUSIVELY FOR THE PURPSES SET FORTH IN THIS ACT.</w:t>
       </w:r>
     </w:p>
     <w:p>
@@ -6479,23 +6434,7 @@
           <w:i/>
           <w:iCs/>
         </w:rPr>
-        <w:t>Added this code of new and reused funds to the code-</w:t>
-      </w:r>
-      <w:proofErr w:type="spellStart"/>
-      <w:r>
-        <w:rPr>
-          <w:i/>
-          <w:iCs/>
-        </w:rPr>
-        <w:t>cleaning.qmd</w:t>
-      </w:r>
-      <w:proofErr w:type="spellEnd"/>
-      <w:r>
-        <w:rPr>
-          <w:i/>
-          <w:iCs/>
-        </w:rPr>
-        <w:t xml:space="preserve"> file: </w:t>
+        <w:t xml:space="preserve">Added this code of new and reused funds to the code-cleaning.qmd file: </w:t>
       </w:r>
     </w:p>
     <w:p>
@@ -6525,262 +6464,37 @@
           <w:i/>
           <w:iCs/>
         </w:rPr>
-        <w:t xml:space="preserve">  </w:t>
-      </w:r>
-      <w:proofErr w:type="gramStart"/>
-      <w:r>
+        <w:t xml:space="preserve">  mutate(fund = ifelse(fy &lt; 2025 &amp; fund %in% c("0213", "0235", "0280", "0321", "0456", "0486", "0487", "0507"), str_replace(fund,"0", "9"), as.character(fund)),   </w:t>
+      </w:r>
+    </w:p>
+    <w:p>
+      <w:pPr>
         <w:rPr>
           <w:i/>
           <w:iCs/>
         </w:rPr>
-        <w:t>mutate(</w:t>
-      </w:r>
-      <w:proofErr w:type="gramEnd"/>
+      </w:pPr>
       <w:r>
         <w:rPr>
           <w:i/>
           <w:iCs/>
         </w:rPr>
-        <w:t xml:space="preserve">fund = </w:t>
-      </w:r>
-      <w:proofErr w:type="gramStart"/>
-      <w:r>
+        <w:t xml:space="preserve">         fund = ifelse(fy &lt; 2025 &amp; fund == "0253", "10253", as.character(fund), # fund reused for 3rd time)  </w:t>
+      </w:r>
+    </w:p>
+    <w:p>
+      <w:pPr>
         <w:rPr>
           <w:i/>
           <w:iCs/>
         </w:rPr>
-        <w:t>ifelse(</w:t>
-      </w:r>
-      <w:proofErr w:type="spellStart"/>
-      <w:proofErr w:type="gramEnd"/>
+      </w:pPr>
       <w:r>
         <w:rPr>
           <w:i/>
           <w:iCs/>
         </w:rPr>
-        <w:t>fy</w:t>
-      </w:r>
-      <w:proofErr w:type="spellEnd"/>
-      <w:r>
-        <w:rPr>
-          <w:i/>
-          <w:iCs/>
-        </w:rPr>
-        <w:t xml:space="preserve"> &lt; 2025 &amp; fund %in% </w:t>
-      </w:r>
-      <w:proofErr w:type="gramStart"/>
-      <w:r>
-        <w:rPr>
-          <w:i/>
-          <w:iCs/>
-        </w:rPr>
-        <w:t>c(</w:t>
-      </w:r>
-      <w:proofErr w:type="gramEnd"/>
-      <w:r>
-        <w:rPr>
-          <w:i/>
-          <w:iCs/>
-        </w:rPr>
-        <w:t xml:space="preserve">"0213", "0235", "0280", "0321", "0456", "0486", "0487", "0507"), </w:t>
-      </w:r>
-      <w:proofErr w:type="spellStart"/>
-      <w:r>
-        <w:rPr>
-          <w:i/>
-          <w:iCs/>
-        </w:rPr>
-        <w:t>str_</w:t>
-      </w:r>
-      <w:proofErr w:type="gramStart"/>
-      <w:r>
-        <w:rPr>
-          <w:i/>
-          <w:iCs/>
-        </w:rPr>
-        <w:t>replace</w:t>
-      </w:r>
-      <w:proofErr w:type="spellEnd"/>
-      <w:r>
-        <w:rPr>
-          <w:i/>
-          <w:iCs/>
-        </w:rPr>
-        <w:t>(</w:t>
-      </w:r>
-      <w:proofErr w:type="gramEnd"/>
-      <w:r>
-        <w:rPr>
-          <w:i/>
-          <w:iCs/>
-        </w:rPr>
-        <w:t xml:space="preserve">fund,"0", "9"), </w:t>
-      </w:r>
-      <w:proofErr w:type="spellStart"/>
-      <w:proofErr w:type="gramStart"/>
-      <w:r>
-        <w:rPr>
-          <w:i/>
-          <w:iCs/>
-        </w:rPr>
-        <w:t>as.character</w:t>
-      </w:r>
-      <w:proofErr w:type="spellEnd"/>
-      <w:proofErr w:type="gramEnd"/>
-      <w:r>
-        <w:rPr>
-          <w:i/>
-          <w:iCs/>
-        </w:rPr>
-        <w:t xml:space="preserve">(fund)),   </w:t>
-      </w:r>
-    </w:p>
-    <w:p>
-      <w:pPr>
-        <w:rPr>
-          <w:i/>
-          <w:iCs/>
-        </w:rPr>
-      </w:pPr>
-      <w:r>
-        <w:rPr>
-          <w:i/>
-          <w:iCs/>
-        </w:rPr>
-        <w:t xml:space="preserve">         fund = </w:t>
-      </w:r>
-      <w:proofErr w:type="gramStart"/>
-      <w:r>
-        <w:rPr>
-          <w:i/>
-          <w:iCs/>
-        </w:rPr>
-        <w:t>ifelse(</w:t>
-      </w:r>
-      <w:proofErr w:type="spellStart"/>
-      <w:proofErr w:type="gramEnd"/>
-      <w:r>
-        <w:rPr>
-          <w:i/>
-          <w:iCs/>
-        </w:rPr>
-        <w:t>fy</w:t>
-      </w:r>
-      <w:proofErr w:type="spellEnd"/>
-      <w:r>
-        <w:rPr>
-          <w:i/>
-          <w:iCs/>
-        </w:rPr>
-        <w:t xml:space="preserve"> &lt; 2025 &amp; fund == "0253", "10253", </w:t>
-      </w:r>
-      <w:proofErr w:type="spellStart"/>
-      <w:proofErr w:type="gramStart"/>
-      <w:r>
-        <w:rPr>
-          <w:i/>
-          <w:iCs/>
-        </w:rPr>
-        <w:t>as.character</w:t>
-      </w:r>
-      <w:proofErr w:type="spellEnd"/>
-      <w:proofErr w:type="gramEnd"/>
-      <w:r>
-        <w:rPr>
-          <w:i/>
-          <w:iCs/>
-        </w:rPr>
-        <w:t>(fund</w:t>
-      </w:r>
-      <w:proofErr w:type="gramStart"/>
-      <w:r>
-        <w:rPr>
-          <w:i/>
-          <w:iCs/>
-        </w:rPr>
-        <w:t>), #</w:t>
-      </w:r>
-      <w:proofErr w:type="gramEnd"/>
-      <w:r>
-        <w:rPr>
-          <w:i/>
-          <w:iCs/>
-        </w:rPr>
-        <w:t xml:space="preserve"> fund reused for 3rd time)  </w:t>
-      </w:r>
-    </w:p>
-    <w:p>
-      <w:pPr>
-        <w:rPr>
-          <w:i/>
-          <w:iCs/>
-        </w:rPr>
-      </w:pPr>
-      <w:r>
-        <w:rPr>
-          <w:i/>
-          <w:iCs/>
-        </w:rPr>
-        <w:t xml:space="preserve">         fund = </w:t>
-      </w:r>
-      <w:proofErr w:type="gramStart"/>
-      <w:r>
-        <w:rPr>
-          <w:i/>
-          <w:iCs/>
-        </w:rPr>
-        <w:t>ifelse(</w:t>
-      </w:r>
-      <w:proofErr w:type="spellStart"/>
-      <w:proofErr w:type="gramEnd"/>
-      <w:r>
-        <w:rPr>
-          <w:i/>
-          <w:iCs/>
-        </w:rPr>
-        <w:t>fy</w:t>
-      </w:r>
-      <w:proofErr w:type="spellEnd"/>
-      <w:r>
-        <w:rPr>
-          <w:i/>
-          <w:iCs/>
-        </w:rPr>
-        <w:t xml:space="preserve"> &lt; 2025 &amp; fund == "0526", "10526", </w:t>
-      </w:r>
-      <w:proofErr w:type="spellStart"/>
-      <w:proofErr w:type="gramStart"/>
-      <w:r>
-        <w:rPr>
-          <w:i/>
-          <w:iCs/>
-        </w:rPr>
-        <w:t>as.character</w:t>
-      </w:r>
-      <w:proofErr w:type="spellEnd"/>
-      <w:proofErr w:type="gramEnd"/>
-      <w:r>
-        <w:rPr>
-          <w:i/>
-          <w:iCs/>
-        </w:rPr>
-        <w:t>(</w:t>
-      </w:r>
-      <w:proofErr w:type="gramStart"/>
-      <w:r>
-        <w:rPr>
-          <w:i/>
-          <w:iCs/>
-        </w:rPr>
-        <w:t>fund)  )</w:t>
-      </w:r>
-      <w:proofErr w:type="gramEnd"/>
-      <w:r>
-        <w:rPr>
-          <w:i/>
-          <w:iCs/>
-        </w:rPr>
-        <w:t xml:space="preserve"> # fund reused for 3rd time)  </w:t>
+        <w:t xml:space="preserve">         fund = ifelse(fy &lt; 2025 &amp; fund == "0526", "10526", as.character(fund)  ) # fund reused for 3rd time)  </w:t>
       </w:r>
     </w:p>
     <w:p>

</xml_diff>

<commit_message>
adds 0724 dept of labor federa trust
</commit_message>
<xml_diff>
--- a/data/FY2025 Files/FY25 New Data Items.docx
+++ b/data/FY2025 Files/FY25 New Data Items.docx
@@ -14,8 +14,21 @@
       </w:r>
     </w:p>
     <w:p>
-      <w:r>
-        <w:t xml:space="preserve">Code_cleaning.qmd file was ran to identify any changes in funds, sources, agencies, organizations, etc. from past years. Screenshot below is one example of differences found for the revenue sources and source names. </w:t>
+      <w:proofErr w:type="spellStart"/>
+      <w:r>
+        <w:t>Code_cleaning.qmd</w:t>
+      </w:r>
+      <w:proofErr w:type="spellEnd"/>
+      <w:r>
+        <w:t xml:space="preserve"> file was </w:t>
+      </w:r>
+      <w:proofErr w:type="gramStart"/>
+      <w:r>
+        <w:t>ran</w:t>
+      </w:r>
+      <w:proofErr w:type="gramEnd"/>
+      <w:r>
+        <w:t xml:space="preserve"> to identify any changes in funds, sources, agencies, organizations, etc. from past years. Screenshot below is one example of differences found for the revenue sources and source names. </w:t>
       </w:r>
     </w:p>
     <w:p>
@@ -73,7 +86,31 @@
         <w:spacing w:after="0"/>
       </w:pPr>
       <w:r>
-        <w:t xml:space="preserve">Go to comptrollers website (ilinoiscomptroller.gov &gt; Financial Reports &amp; Data&gt; and then Expenditures or Revenues depending on what you are doing) and search each revenue source to see the category assigned by the comptroller. Add that variable to rev_type_name_COMPTROLLER in ioc_sources.xlsx. </w:t>
+        <w:t xml:space="preserve">Go to </w:t>
+      </w:r>
+      <w:proofErr w:type="gramStart"/>
+      <w:r>
+        <w:t>comptrollers</w:t>
+      </w:r>
+      <w:proofErr w:type="gramEnd"/>
+      <w:r>
+        <w:t xml:space="preserve"> website (ilinoiscomptroller.gov &gt; Financial Reports &amp; Data&gt; and then Expenditures or Revenues depending on what you are doing) and </w:t>
+      </w:r>
+      <w:proofErr w:type="gramStart"/>
+      <w:r>
+        <w:t>search</w:t>
+      </w:r>
+      <w:proofErr w:type="gramEnd"/>
+      <w:r>
+        <w:t xml:space="preserve"> each revenue source to see the category assigned by the comptroller. Add that variable to </w:t>
+      </w:r>
+      <w:proofErr w:type="spellStart"/>
+      <w:r>
+        <w:t>rev_type_name_COMPTROLLER</w:t>
+      </w:r>
+      <w:proofErr w:type="spellEnd"/>
+      <w:r>
+        <w:t xml:space="preserve"> in ioc_sources.xlsx. </w:t>
       </w:r>
     </w:p>
     <w:p>
@@ -86,7 +123,31 @@
         <w:spacing w:after="0"/>
       </w:pPr>
       <w:r>
-        <w:t>For each rev source identified by code_cleaning.qmd, I searched the source number on the comptrollers website to see what the name and type of source it was. Also used best judgement for names were just slightly different to determine if they were not new revenue sources.</w:t>
+        <w:t xml:space="preserve">For each rev source identified by </w:t>
+      </w:r>
+      <w:proofErr w:type="spellStart"/>
+      <w:r>
+        <w:t>code_cleaning.qmd</w:t>
+      </w:r>
+      <w:proofErr w:type="spellEnd"/>
+      <w:r>
+        <w:t xml:space="preserve">, I </w:t>
+      </w:r>
+      <w:proofErr w:type="gramStart"/>
+      <w:r>
+        <w:t>searched</w:t>
+      </w:r>
+      <w:proofErr w:type="gramEnd"/>
+      <w:r>
+        <w:t xml:space="preserve"> the source number on the </w:t>
+      </w:r>
+      <w:proofErr w:type="gramStart"/>
+      <w:r>
+        <w:t>comptrollers</w:t>
+      </w:r>
+      <w:proofErr w:type="gramEnd"/>
+      <w:r>
+        <w:t xml:space="preserve"> website to see what the name and type of source it was. Also used best judgement for names were just slightly different to determine if they were not new revenue sources.</w:t>
       </w:r>
     </w:p>
     <w:p>
@@ -185,6 +246,7 @@
                 <w:szCs w:val="20"/>
               </w:rPr>
             </w:pPr>
+            <w:proofErr w:type="spellStart"/>
             <w:r>
               <w:rPr>
                 <w:b/>
@@ -194,6 +256,7 @@
               </w:rPr>
               <w:t>Source_name</w:t>
             </w:r>
+            <w:proofErr w:type="spellEnd"/>
           </w:p>
         </w:tc>
         <w:tc>
@@ -276,6 +339,7 @@
                 <w:highlight w:val="green"/>
               </w:rPr>
             </w:pPr>
+            <w:proofErr w:type="spellStart"/>
             <w:r>
               <w:rPr>
                 <w:b/>
@@ -286,6 +350,7 @@
               </w:rPr>
               <w:t>Rev_type_number</w:t>
             </w:r>
+            <w:proofErr w:type="spellEnd"/>
           </w:p>
         </w:tc>
         <w:tc>
@@ -304,6 +369,7 @@
                 <w:highlight w:val="green"/>
               </w:rPr>
             </w:pPr>
+            <w:proofErr w:type="spellStart"/>
             <w:r>
               <w:rPr>
                 <w:b/>
@@ -314,6 +380,7 @@
               </w:rPr>
               <w:t>Rev_type_name</w:t>
             </w:r>
+            <w:proofErr w:type="spellEnd"/>
           </w:p>
         </w:tc>
       </w:tr>
@@ -3067,11 +3134,29 @@
         <w:t xml:space="preserve"> </w:t>
       </w:r>
       <w:r>
-        <w:t xml:space="preserve">variables in ioc_sources file!! Rev_type_name, </w:t>
-      </w:r>
+        <w:t xml:space="preserve">variables in </w:t>
+      </w:r>
+      <w:proofErr w:type="spellStart"/>
+      <w:r>
+        <w:t>ioc_sources</w:t>
+      </w:r>
+      <w:proofErr w:type="spellEnd"/>
+      <w:r>
+        <w:t xml:space="preserve"> file!! </w:t>
+      </w:r>
+      <w:proofErr w:type="spellStart"/>
+      <w:r>
+        <w:t>Rev_type_name</w:t>
+      </w:r>
+      <w:proofErr w:type="spellEnd"/>
+      <w:r>
+        <w:t xml:space="preserve">, </w:t>
+      </w:r>
+      <w:proofErr w:type="spellStart"/>
       <w:r>
         <w:t>rev_type_name_COMPTROLLER</w:t>
       </w:r>
+      <w:proofErr w:type="spellEnd"/>
       <w:r>
         <w:t xml:space="preserve"> </w:t>
       </w:r>
@@ -3108,7 +3193,15 @@
     </w:p>
     <w:p>
       <w:r>
-        <w:t xml:space="preserve">Search fund and find out informatin about it. IOC has fund search options: </w:t>
+        <w:t xml:space="preserve">Search </w:t>
+      </w:r>
+      <w:proofErr w:type="gramStart"/>
+      <w:r>
+        <w:t>fund</w:t>
+      </w:r>
+      <w:proofErr w:type="gramEnd"/>
+      <w:r>
+        <w:t xml:space="preserve"> and find out informatin about it. IOC has fund search options: </w:t>
       </w:r>
       <w:hyperlink r:id="rId6" w:history="1">
         <w:r>
@@ -3194,9 +3287,11 @@
             <w:vAlign w:val="center"/>
           </w:tcPr>
           <w:p>
+            <w:proofErr w:type="spellStart"/>
             <w:r>
               <w:t>Fund_name</w:t>
             </w:r>
+            <w:proofErr w:type="spellEnd"/>
           </w:p>
         </w:tc>
         <w:tc>
@@ -3350,12 +3445,28 @@
               <w:t xml:space="preserve">Exclude from expenditures probably just a holding fund. </w:t>
             </w:r>
             <w:r>
-              <w:t xml:space="preserve"> --- look into more still</w:t>
-            </w:r>
-          </w:p>
-          <w:p>
-            <w:r>
-              <w:t>Look into on revenue side.</w:t>
+              <w:t xml:space="preserve"> --- </w:t>
+            </w:r>
+            <w:proofErr w:type="gramStart"/>
+            <w:r>
+              <w:t>look into</w:t>
+            </w:r>
+            <w:proofErr w:type="gramEnd"/>
+            <w:r>
+              <w:t xml:space="preserve"> more still</w:t>
+            </w:r>
+          </w:p>
+          <w:p>
+            <w:r>
+              <w:t xml:space="preserve">Look into </w:t>
+            </w:r>
+            <w:proofErr w:type="gramStart"/>
+            <w:r>
+              <w:t>on</w:t>
+            </w:r>
+            <w:proofErr w:type="gramEnd"/>
+            <w:r>
+              <w:t xml:space="preserve"> revenue side.</w:t>
             </w:r>
           </w:p>
         </w:tc>
@@ -3740,6 +3851,7 @@
             <w:hideMark/>
           </w:tcPr>
           <w:p>
+            <w:proofErr w:type="gramStart"/>
             <w:r>
               <w:t>REUSED-3</w:t>
             </w:r>
@@ -3749,6 +3861,7 @@
               </w:rPr>
               <w:t>rd</w:t>
             </w:r>
+            <w:proofErr w:type="gramEnd"/>
             <w:r>
               <w:t xml:space="preserve"> time! </w:t>
             </w:r>
@@ -5403,11 +5516,130 @@
           </w:p>
         </w:tc>
       </w:tr>
+      <w:tr>
+        <w:trPr>
+          <w:trHeight w:val="446"/>
+          <w:tblCellSpacing w:w="0" w:type="dxa"/>
+        </w:trPr>
+        <w:tc>
+          <w:tcPr>
+            <w:tcW w:w="990" w:type="dxa"/>
+            <w:noWrap/>
+            <w:tcMar>
+              <w:top w:w="30" w:type="dxa"/>
+              <w:left w:w="90" w:type="dxa"/>
+              <w:bottom w:w="30" w:type="dxa"/>
+              <w:right w:w="90" w:type="dxa"/>
+            </w:tcMar>
+            <w:vAlign w:val="center"/>
+          </w:tcPr>
+          <w:p>
+            <w:pPr>
+              <w:rPr>
+                <w:strike/>
+              </w:rPr>
+            </w:pPr>
+            <w:r>
+              <w:rPr>
+                <w:strike/>
+              </w:rPr>
+              <w:t>0724</w:t>
+            </w:r>
+          </w:p>
+        </w:tc>
+        <w:tc>
+          <w:tcPr>
+            <w:tcW w:w="3960" w:type="dxa"/>
+            <w:noWrap/>
+            <w:tcMar>
+              <w:top w:w="30" w:type="dxa"/>
+              <w:left w:w="90" w:type="dxa"/>
+              <w:bottom w:w="30" w:type="dxa"/>
+              <w:right w:w="90" w:type="dxa"/>
+            </w:tcMar>
+            <w:vAlign w:val="center"/>
+          </w:tcPr>
+          <w:p>
+            <w:pPr>
+              <w:rPr>
+                <w:strike/>
+              </w:rPr>
+            </w:pPr>
+            <w:r>
+              <w:rPr>
+                <w:strike/>
+              </w:rPr>
+              <w:t>DEPT OF LABOR FEDERAL TRUST</w:t>
+            </w:r>
+          </w:p>
+        </w:tc>
+        <w:tc>
+          <w:tcPr>
+            <w:tcW w:w="2250" w:type="dxa"/>
+            <w:noWrap/>
+            <w:tcMar>
+              <w:top w:w="30" w:type="dxa"/>
+              <w:left w:w="90" w:type="dxa"/>
+              <w:bottom w:w="30" w:type="dxa"/>
+              <w:right w:w="90" w:type="dxa"/>
+            </w:tcMar>
+            <w:vAlign w:val="center"/>
+          </w:tcPr>
+          <w:p>
+            <w:pPr>
+              <w:rPr>
+                <w:strike/>
+              </w:rPr>
+            </w:pPr>
+          </w:p>
+        </w:tc>
+        <w:tc>
+          <w:tcPr>
+            <w:tcW w:w="2340" w:type="dxa"/>
+            <w:noWrap/>
+            <w:tcMar>
+              <w:top w:w="30" w:type="dxa"/>
+              <w:left w:w="90" w:type="dxa"/>
+              <w:bottom w:w="30" w:type="dxa"/>
+              <w:right w:w="90" w:type="dxa"/>
+            </w:tcMar>
+            <w:vAlign w:val="center"/>
+          </w:tcPr>
+          <w:p>
+            <w:pPr>
+              <w:jc w:val="right"/>
+              <w:rPr>
+                <w:strike/>
+              </w:rPr>
+            </w:pPr>
+          </w:p>
+        </w:tc>
+        <w:tc>
+          <w:tcPr>
+            <w:tcW w:w="1620" w:type="dxa"/>
+          </w:tcPr>
+          <w:p>
+            <w:pPr>
+              <w:rPr>
+                <w:strike/>
+              </w:rPr>
+            </w:pPr>
+          </w:p>
+        </w:tc>
+      </w:tr>
     </w:tbl>
     <w:p/>
     <w:p>
       <w:r>
-        <w:t>Go look up fund on IOC website to find other variables that need to be filled in in the funds_ab_in.xlsx file. Fill in fund category</w:t>
+        <w:t xml:space="preserve">Go look up </w:t>
+      </w:r>
+      <w:proofErr w:type="gramStart"/>
+      <w:r>
+        <w:t>fund</w:t>
+      </w:r>
+      <w:proofErr w:type="gramEnd"/>
+      <w:r>
+        <w:t xml:space="preserve"> on IOC website to find other variables that need to be filled in in the funds_ab_in.xlsx file. Fill in fund category</w:t>
       </w:r>
       <w:r>
         <w:t xml:space="preserve"> and</w:t>
@@ -5425,7 +5657,6 @@
     <w:p/>
     <w:p>
       <w:r>
-        <w:lastRenderedPageBreak/>
         <w:t>New Fund Information</w:t>
       </w:r>
     </w:p>
@@ -5557,7 +5788,15 @@
         </w:numPr>
       </w:pPr>
       <w:r>
-        <w:t>Not used yet. Info not on comptrollers website as of 7/17/2025</w:t>
+        <w:t xml:space="preserve">Not used yet. Info not on </w:t>
+      </w:r>
+      <w:proofErr w:type="gramStart"/>
+      <w:r>
+        <w:t>comptrollers</w:t>
+      </w:r>
+      <w:proofErr w:type="gramEnd"/>
+      <w:r>
+        <w:t xml:space="preserve"> website as of 7/17/2025</w:t>
       </w:r>
     </w:p>
     <w:p>
@@ -5573,7 +5812,15 @@
         </w:numPr>
       </w:pPr>
       <w:r>
-        <w:t>Not used yet. Info not on comptrollers website as of 7/17/2025</w:t>
+        <w:t xml:space="preserve">Not used yet. Info not on </w:t>
+      </w:r>
+      <w:proofErr w:type="gramStart"/>
+      <w:r>
+        <w:t>comptrollers</w:t>
+      </w:r>
+      <w:proofErr w:type="gramEnd"/>
+      <w:r>
+        <w:t xml:space="preserve"> website as of 7/17/2025</w:t>
       </w:r>
     </w:p>
     <w:p>
@@ -5589,7 +5836,15 @@
         </w:numPr>
       </w:pPr>
       <w:r>
-        <w:t>Not used yet. Info not on comptrollers website as of 7/17/2025</w:t>
+        <w:t xml:space="preserve">Not used yet. Info not on </w:t>
+      </w:r>
+      <w:proofErr w:type="gramStart"/>
+      <w:r>
+        <w:t>comptrollers</w:t>
+      </w:r>
+      <w:proofErr w:type="gramEnd"/>
+      <w:r>
+        <w:t xml:space="preserve"> website as of 7/17/2025</w:t>
       </w:r>
     </w:p>
     <w:p>
@@ -5605,11 +5860,20 @@
         </w:numPr>
       </w:pPr>
       <w:r>
-        <w:t>Not used yet. Info not on comptrollers website as of 7/17/2025</w:t>
+        <w:t xml:space="preserve">Not used yet. Info not on </w:t>
+      </w:r>
+      <w:proofErr w:type="gramStart"/>
+      <w:r>
+        <w:t>comptrollers</w:t>
+      </w:r>
+      <w:proofErr w:type="gramEnd"/>
+      <w:r>
+        <w:t xml:space="preserve"> website as of 7/17/2025</w:t>
       </w:r>
     </w:p>
     <w:p>
       <w:r>
+        <w:lastRenderedPageBreak/>
         <w:t>Water Resources</w:t>
       </w:r>
     </w:p>
@@ -5621,12 +5885,19 @@
         </w:numPr>
       </w:pPr>
       <w:r>
-        <w:t>Not used yet. Info not on comptrollers website as of 7/17/2025</w:t>
+        <w:t xml:space="preserve">Not used yet. Info not on </w:t>
+      </w:r>
+      <w:proofErr w:type="gramStart"/>
+      <w:r>
+        <w:t>comptrollers</w:t>
+      </w:r>
+      <w:proofErr w:type="gramEnd"/>
+      <w:r>
+        <w:t xml:space="preserve"> website as of 7/17/2025</w:t>
       </w:r>
     </w:p>
     <w:p>
       <w:r>
-        <w:lastRenderedPageBreak/>
         <w:t>Health Equity and Access</w:t>
       </w:r>
       <w:r>
@@ -5641,7 +5912,15 @@
         </w:numPr>
       </w:pPr>
       <w:r>
-        <w:t>Not used yet. Info not on comptrollers website as of 7/17/2025</w:t>
+        <w:t xml:space="preserve">Not used yet. Info not on </w:t>
+      </w:r>
+      <w:proofErr w:type="gramStart"/>
+      <w:r>
+        <w:t>comptrollers</w:t>
+      </w:r>
+      <w:proofErr w:type="gramEnd"/>
+      <w:r>
+        <w:t xml:space="preserve"> website as of 7/17/2025</w:t>
       </w:r>
     </w:p>
     <w:p/>
@@ -5870,6 +6149,7 @@
           <w:b/>
           <w:bCs/>
         </w:rPr>
+        <w:lastRenderedPageBreak/>
         <w:t>ADMINISTERING AGENCY:</w:t>
       </w:r>
       <w:r>
@@ -5899,11 +6179,7 @@
       </w:r>
       <w:r>
         <w:br/>
-        <w:t xml:space="preserve">IS CREATED AS A SPECIAL FUND IN THE STATE TREASURY. ALL MONEYS IN THE </w:t>
-      </w:r>
-      <w:r>
-        <w:lastRenderedPageBreak/>
-        <w:t xml:space="preserve">FUND SHALL BE APPROPRIATED TO THE DEPARTMENT OF HEALTHCARE AND FAMILY SERVICES AND EXPENDED </w:t>
+        <w:t xml:space="preserve">IS CREATED AS A SPECIAL FUND IN THE STATE TREASURY. ALL MONEYS IN THE FUND SHALL BE APPROPRIATED TO THE DEPARTMENT OF HEALTHCARE AND FAMILY SERVICES AND EXPENDED </w:t>
       </w:r>
       <w:r>
         <w:rPr>
@@ -5912,7 +6188,15 @@
         <w:t>EXCLUSIVELY FOR THE MEDICAL DEBT RELIEF PILOT PROGRAM TO PROVIDE GRANT FUNDING TO A NONPROFIT MEDICAL DEBT RELIEF COORDINATOR</w:t>
       </w:r>
       <w:r>
-        <w:t xml:space="preserve"> TO BE USED TO DISCHARGE THE MDICAL DEBT OF ELIGIBLE RESIDENTS AS DEFINED IN THE MEDICAL DEBT RELIEF ACT. BASED ON A BUDGET APPROVED BY DEPARTMENT, THE GRANT FUNDING MAY ALSO BE USED FOR ANY ADMIN SERVICES PROVIDED BY THE NONPROFIT MEDICAL DEBT REL COORD TO DISCHRGE MED DEBT</w:t>
+        <w:t xml:space="preserve"> TO BE USED TO DISCHARGE THE MDICAL DEBT OF ELIGIBLE RESIDENTS AS DEFINED IN THE MEDICAL DEBT RELIEF ACT. BASED ON A BUDGET APPROVED BY DEPARTMENT, THE GRANT </w:t>
+      </w:r>
+      <w:proofErr w:type="gramStart"/>
+      <w:r>
+        <w:t>FUNDING MAY</w:t>
+      </w:r>
+      <w:proofErr w:type="gramEnd"/>
+      <w:r>
+        <w:t xml:space="preserve"> ALSO BE USED FOR ANY ADMIN SERVICES PROVIDED BY THE NONPROFIT MEDICAL DEBT REL COORD TO DISCHRGE MED DEBT</w:t>
       </w:r>
     </w:p>
     <w:p>
@@ -6075,6 +6359,7 @@
         </w:numPr>
       </w:pPr>
       <w:r>
+        <w:lastRenderedPageBreak/>
         <w:t>IL STUDENT ASSISTANCE COMM</w:t>
       </w:r>
     </w:p>
@@ -6366,11 +6651,11 @@
         <w:t>TRUST FUND TO BE HELD OUTSIDE THE STATE TREASURY,</w:t>
       </w:r>
       <w:r>
-        <w:t xml:space="preserve"> WITH THE STATE TREASURER AS CUSTODIAN. THE COMMISSION MAY ACCEPT MONETARY GIFTS AND GRANTS FROM ANY PUBLIC OR PRIVATE SOURCE, WHICH SHALL BE HELD IN THE FUND. ALL GIFTS, GRANTS, ASSETS, FUNDS, OR MONEY RECEIVED BY THE COMMISSION UNDER THIS ACT SHALL BE DEPOSITED AND HELD IN THE FUND BY THE STATE TREASURER AS EX OFFICIO CUSTODIAN SEPARATE AND APART FROM ALL PUBLIC MONEY OR </w:t>
+        <w:t xml:space="preserve"> WITH THE STATE TREASURER AS CUSTODIAN. THE COMMISSION MAY ACCEPT MONETARY GIFTS AND GRANTS FROM ANY PUBLIC </w:t>
       </w:r>
       <w:r>
         <w:lastRenderedPageBreak/>
-        <w:t>FUNDS OF THIS STATE AND SHALL BE ADMINISTERED BY THE COMMISSION EXCLUSIVELY FOR THE PURPSES SET FORTH IN THIS ACT.</w:t>
+        <w:t>OR PRIVATE SOURCE, WHICH SHALL BE HELD IN THE FUND. ALL GIFTS, GRANTS, ASSETS, FUNDS, OR MONEY RECEIVED BY THE COMMISSION UNDER THIS ACT SHALL BE DEPOSITED AND HELD IN THE FUND BY THE STATE TREASURER AS EX OFFICIO CUSTODIAN SEPARATE AND APART FROM ALL PUBLIC MONEY OR FUNDS OF THIS STATE AND SHALL BE ADMINISTERED BY THE COMMISSION EXCLUSIVELY FOR THE PURPSES SET FORTH IN THIS ACT.</w:t>
       </w:r>
     </w:p>
     <w:p>
@@ -6434,7 +6719,23 @@
           <w:i/>
           <w:iCs/>
         </w:rPr>
-        <w:t xml:space="preserve">Added this code of new and reused funds to the code-cleaning.qmd file: </w:t>
+        <w:t>Added this code of new and reused funds to the code-</w:t>
+      </w:r>
+      <w:proofErr w:type="spellStart"/>
+      <w:r>
+        <w:rPr>
+          <w:i/>
+          <w:iCs/>
+        </w:rPr>
+        <w:t>cleaning.qmd</w:t>
+      </w:r>
+      <w:proofErr w:type="spellEnd"/>
+      <w:r>
+        <w:rPr>
+          <w:i/>
+          <w:iCs/>
+        </w:rPr>
+        <w:t xml:space="preserve"> file: </w:t>
       </w:r>
     </w:p>
     <w:p>
@@ -6464,7 +6765,114 @@
           <w:i/>
           <w:iCs/>
         </w:rPr>
-        <w:t xml:space="preserve">  mutate(fund = ifelse(fy &lt; 2025 &amp; fund %in% c("0213", "0235", "0280", "0321", "0456", "0486", "0487", "0507"), str_replace(fund,"0", "9"), as.character(fund)),   </w:t>
+        <w:t xml:space="preserve">  </w:t>
+      </w:r>
+      <w:proofErr w:type="gramStart"/>
+      <w:r>
+        <w:rPr>
+          <w:i/>
+          <w:iCs/>
+        </w:rPr>
+        <w:t>mutate(</w:t>
+      </w:r>
+      <w:proofErr w:type="gramEnd"/>
+      <w:r>
+        <w:rPr>
+          <w:i/>
+          <w:iCs/>
+        </w:rPr>
+        <w:t xml:space="preserve">fund = </w:t>
+      </w:r>
+      <w:proofErr w:type="gramStart"/>
+      <w:r>
+        <w:rPr>
+          <w:i/>
+          <w:iCs/>
+        </w:rPr>
+        <w:t>ifelse(</w:t>
+      </w:r>
+      <w:proofErr w:type="spellStart"/>
+      <w:proofErr w:type="gramEnd"/>
+      <w:r>
+        <w:rPr>
+          <w:i/>
+          <w:iCs/>
+        </w:rPr>
+        <w:t>fy</w:t>
+      </w:r>
+      <w:proofErr w:type="spellEnd"/>
+      <w:r>
+        <w:rPr>
+          <w:i/>
+          <w:iCs/>
+        </w:rPr>
+        <w:t xml:space="preserve"> &lt; 2025 &amp; fund %in% </w:t>
+      </w:r>
+      <w:proofErr w:type="gramStart"/>
+      <w:r>
+        <w:rPr>
+          <w:i/>
+          <w:iCs/>
+        </w:rPr>
+        <w:t>c(</w:t>
+      </w:r>
+      <w:proofErr w:type="gramEnd"/>
+      <w:r>
+        <w:rPr>
+          <w:i/>
+          <w:iCs/>
+        </w:rPr>
+        <w:t xml:space="preserve">"0213", "0235", "0280", "0321", "0456", "0486", "0487", "0507"), </w:t>
+      </w:r>
+      <w:proofErr w:type="spellStart"/>
+      <w:r>
+        <w:rPr>
+          <w:i/>
+          <w:iCs/>
+        </w:rPr>
+        <w:t>str_</w:t>
+      </w:r>
+      <w:proofErr w:type="gramStart"/>
+      <w:r>
+        <w:rPr>
+          <w:i/>
+          <w:iCs/>
+        </w:rPr>
+        <w:t>replace</w:t>
+      </w:r>
+      <w:proofErr w:type="spellEnd"/>
+      <w:r>
+        <w:rPr>
+          <w:i/>
+          <w:iCs/>
+        </w:rPr>
+        <w:t>(</w:t>
+      </w:r>
+      <w:proofErr w:type="gramEnd"/>
+      <w:r>
+        <w:rPr>
+          <w:i/>
+          <w:iCs/>
+        </w:rPr>
+        <w:t xml:space="preserve">fund,"0", "9"), </w:t>
+      </w:r>
+      <w:proofErr w:type="spellStart"/>
+      <w:proofErr w:type="gramStart"/>
+      <w:r>
+        <w:rPr>
+          <w:i/>
+          <w:iCs/>
+        </w:rPr>
+        <w:t>as.character</w:t>
+      </w:r>
+      <w:proofErr w:type="spellEnd"/>
+      <w:proofErr w:type="gramEnd"/>
+      <w:r>
+        <w:rPr>
+          <w:i/>
+          <w:iCs/>
+        </w:rPr>
+        <w:t xml:space="preserve">(fund)),   </w:t>
       </w:r>
     </w:p>
     <w:p>
@@ -6479,7 +6887,66 @@
           <w:i/>
           <w:iCs/>
         </w:rPr>
-        <w:t xml:space="preserve">         fund = ifelse(fy &lt; 2025 &amp; fund == "0253", "10253", as.character(fund), # fund reused for 3rd time)  </w:t>
+        <w:t xml:space="preserve">         fund = </w:t>
+      </w:r>
+      <w:proofErr w:type="gramStart"/>
+      <w:r>
+        <w:rPr>
+          <w:i/>
+          <w:iCs/>
+        </w:rPr>
+        <w:t>ifelse(</w:t>
+      </w:r>
+      <w:proofErr w:type="spellStart"/>
+      <w:proofErr w:type="gramEnd"/>
+      <w:r>
+        <w:rPr>
+          <w:i/>
+          <w:iCs/>
+        </w:rPr>
+        <w:t>fy</w:t>
+      </w:r>
+      <w:proofErr w:type="spellEnd"/>
+      <w:r>
+        <w:rPr>
+          <w:i/>
+          <w:iCs/>
+        </w:rPr>
+        <w:t xml:space="preserve"> &lt; 2025 &amp; fund == "0253", "10253", </w:t>
+      </w:r>
+      <w:proofErr w:type="spellStart"/>
+      <w:proofErr w:type="gramStart"/>
+      <w:r>
+        <w:rPr>
+          <w:i/>
+          <w:iCs/>
+        </w:rPr>
+        <w:t>as.character</w:t>
+      </w:r>
+      <w:proofErr w:type="spellEnd"/>
+      <w:proofErr w:type="gramEnd"/>
+      <w:r>
+        <w:rPr>
+          <w:i/>
+          <w:iCs/>
+        </w:rPr>
+        <w:t>(fund</w:t>
+      </w:r>
+      <w:proofErr w:type="gramStart"/>
+      <w:r>
+        <w:rPr>
+          <w:i/>
+          <w:iCs/>
+        </w:rPr>
+        <w:t>), #</w:t>
+      </w:r>
+      <w:proofErr w:type="gramEnd"/>
+      <w:r>
+        <w:rPr>
+          <w:i/>
+          <w:iCs/>
+        </w:rPr>
+        <w:t xml:space="preserve"> fund reused for 3rd time)  </w:t>
       </w:r>
     </w:p>
     <w:p>
@@ -6494,7 +6961,66 @@
           <w:i/>
           <w:iCs/>
         </w:rPr>
-        <w:t xml:space="preserve">         fund = ifelse(fy &lt; 2025 &amp; fund == "0526", "10526", as.character(fund)  ) # fund reused for 3rd time)  </w:t>
+        <w:t xml:space="preserve">         fund = </w:t>
+      </w:r>
+      <w:proofErr w:type="gramStart"/>
+      <w:r>
+        <w:rPr>
+          <w:i/>
+          <w:iCs/>
+        </w:rPr>
+        <w:t>ifelse(</w:t>
+      </w:r>
+      <w:proofErr w:type="spellStart"/>
+      <w:proofErr w:type="gramEnd"/>
+      <w:r>
+        <w:rPr>
+          <w:i/>
+          <w:iCs/>
+        </w:rPr>
+        <w:t>fy</w:t>
+      </w:r>
+      <w:proofErr w:type="spellEnd"/>
+      <w:r>
+        <w:rPr>
+          <w:i/>
+          <w:iCs/>
+        </w:rPr>
+        <w:t xml:space="preserve"> &lt; 2025 &amp; fund == "0526", "10526", </w:t>
+      </w:r>
+      <w:proofErr w:type="spellStart"/>
+      <w:proofErr w:type="gramStart"/>
+      <w:r>
+        <w:rPr>
+          <w:i/>
+          <w:iCs/>
+        </w:rPr>
+        <w:t>as.character</w:t>
+      </w:r>
+      <w:proofErr w:type="spellEnd"/>
+      <w:proofErr w:type="gramEnd"/>
+      <w:r>
+        <w:rPr>
+          <w:i/>
+          <w:iCs/>
+        </w:rPr>
+        <w:t>(</w:t>
+      </w:r>
+      <w:proofErr w:type="gramStart"/>
+      <w:r>
+        <w:rPr>
+          <w:i/>
+          <w:iCs/>
+        </w:rPr>
+        <w:t>fund)  )</w:t>
+      </w:r>
+      <w:proofErr w:type="gramEnd"/>
+      <w:r>
+        <w:rPr>
+          <w:i/>
+          <w:iCs/>
+        </w:rPr>
+        <w:t xml:space="preserve"> # fund reused for 3rd time)  </w:t>
       </w:r>
     </w:p>
     <w:p>
@@ -8079,6 +8605,7 @@
   <w:style w:type="character" w:default="1" w:styleId="DefaultParagraphFont">
     <w:name w:val="Default Paragraph Font"/>
     <w:uiPriority w:val="1"/>
+    <w:semiHidden/>
     <w:unhideWhenUsed/>
   </w:style>
   <w:style w:type="table" w:default="1" w:styleId="TableNormal">

</xml_diff>